<commit_message>
Entrega 1: classifica verificacoes, declara limitacoes e rastreabilidade
</commit_message>
<xml_diff>
--- a/docs/entrega1_metodologia_resultados_iniciais.docx
+++ b/docs/entrega1_metodologia_resultados_iniciais.docx
@@ -785,6 +785,18 @@
       <w:r>
         <w:rPr>
           <w:rFonts w:ascii="Times New Roman" w:cs="Times New Roman" w:eastAsia="Times New Roman" w:hAnsi="Times New Roman"/>
+          <w:b/>
+          <w:bCs/>
+          <w:i w:val="false"/>
+          <w:iCs w:val="false"/>
+          <w:sz w:val="24"/>
+          <w:szCs w:val="24"/>
+        </w:rPr>
+        <w:t xml:space="preserve">Procedência dos coeficientes. </w:t>
+      </w:r>
+      <w:r>
+        <w:rPr>
+          <w:rFonts w:ascii="Times New Roman" w:cs="Times New Roman" w:eastAsia="Times New Roman" w:hAnsi="Times New Roman"/>
           <w:b w:val="false"/>
           <w:bCs w:val="false"/>
           <w:i w:val="false"/>
@@ -792,7 +804,94 @@
           <w:sz w:val="24"/>
           <w:szCs w:val="24"/>
         </w:rPr>
-        <w:t xml:space="preserve">Os escalares 15 e 3 representam, respectivamente, o incremento base de assimilação por interação bem-sucedida e um fator de eficiência de transferência proporcional ao hiato técnico entre provedor e receptor. São premissas iniciais e serão submetidos a análise de sensibilidade na fase de implementação, e não tratados como constantes absolutas.</w:t>
+        <w:t xml:space="preserve">Os escalares 15 e 3 não são premissas deste trabalho: integram a formulação publicada por Crowder, Robinson e Hughes (2012), na qual o primeiro representa o incremento base de assimilação por interação bem-sucedida e o segundo pondera o ganho adicional pelo hiato técnico entre provedor e receptor. São reproduzidos sem alteração. O que este trabalho decide, e declara como decisão própria, é o contexto em que a equação opera.</w:t>
+      </w:r>
+    </w:p>
+    <w:p>
+      <w:pPr>
+        <w:pStyle w:val="ListParagraph"/>
+        <w:numPr>
+          <w:ilvl w:val="0"/>
+          <w:numId w:val="1"/>
+        </w:numPr>
+        <w:spacing w:after="80" w:line="300"/>
+        <w:jc w:val="both"/>
+      </w:pPr>
+      <w:r>
+        <w:rPr>
+          <w:rFonts w:ascii="Times New Roman" w:cs="Times New Roman" w:eastAsia="Times New Roman" w:hAnsi="Times New Roman"/>
+          <w:b/>
+          <w:bCs/>
+          <w:sz w:val="24"/>
+          <w:szCs w:val="24"/>
+        </w:rPr>
+        <w:t xml:space="preserve">Da formulação original: </w:t>
+      </w:r>
+      <w:r>
+        <w:rPr>
+          <w:rFonts w:ascii="Times New Roman" w:cs="Times New Roman" w:eastAsia="Times New Roman" w:hAnsi="Times New Roman"/>
+          <w:sz w:val="24"/>
+          <w:szCs w:val="24"/>
+        </w:rPr>
+        <w:t xml:space="preserve">a equação e seus dois coeficientes, tal como publicados.</w:t>
+      </w:r>
+    </w:p>
+    <w:p>
+      <w:pPr>
+        <w:pStyle w:val="ListParagraph"/>
+        <w:numPr>
+          <w:ilvl w:val="0"/>
+          <w:numId w:val="1"/>
+        </w:numPr>
+        <w:spacing w:after="80" w:line="300"/>
+        <w:jc w:val="both"/>
+      </w:pPr>
+      <w:r>
+        <w:rPr>
+          <w:rFonts w:ascii="Times New Roman" w:cs="Times New Roman" w:eastAsia="Times New Roman" w:hAnsi="Times New Roman"/>
+          <w:b/>
+          <w:bCs/>
+          <w:sz w:val="24"/>
+          <w:szCs w:val="24"/>
+        </w:rPr>
+        <w:t xml:space="preserve">Adaptação declarada nesta implementação: </w:t>
+      </w:r>
+      <w:r>
+        <w:rPr>
+          <w:rFonts w:ascii="Times New Roman" w:cs="Times New Roman" w:eastAsia="Times New Roman" w:hAnsi="Times New Roman"/>
+          <w:sz w:val="24"/>
+          <w:szCs w:val="24"/>
+        </w:rPr>
+        <w:t xml:space="preserve">os autores estabelecem que o incremento é limitado ao intervalo de zero a três décimos, que a competência resultante não ultrapassa a dificuldade da subtarefa, e que, concluída a subtarefa, a competência do agente RETORNA ao valor de partida, por entenderem que parte da competência é específica da subtarefa. A implementação atual não reproduz esse retorno: o ganho obtido com o apoio permanece entre tarefas. Trata-se de adaptação da dinâmica original, e é assim que deve ser lida — não como correção nem como aperfeiçoamento. Nenhum teste foi executado nesta entrega para comparar as duas dinâmicas, e por isso nada se afirma sobre qual delas representa melhor o fenômeno. A avaliação está registrada como pendência para a etapa seguinte.</w:t>
+      </w:r>
+    </w:p>
+    <w:p>
+      <w:pPr>
+        <w:pStyle w:val="ListParagraph"/>
+        <w:numPr>
+          <w:ilvl w:val="0"/>
+          <w:numId w:val="1"/>
+        </w:numPr>
+        <w:spacing w:after="80" w:line="300"/>
+        <w:jc w:val="both"/>
+      </w:pPr>
+      <w:r>
+        <w:rPr>
+          <w:rFonts w:ascii="Times New Roman" w:cs="Times New Roman" w:eastAsia="Times New Roman" w:hAnsi="Times New Roman"/>
+          <w:b/>
+          <w:bCs/>
+          <w:sz w:val="24"/>
+          <w:szCs w:val="24"/>
+        </w:rPr>
+        <w:t xml:space="preserve">Decisão de operacionalização deste trabalho: </w:t>
+      </w:r>
+      <w:r>
+        <w:rPr>
+          <w:rFonts w:ascii="Times New Roman" w:cs="Times New Roman" w:eastAsia="Times New Roman" w:hAnsi="Times New Roman"/>
+          <w:sz w:val="24"/>
+          <w:szCs w:val="24"/>
+        </w:rPr>
+        <w:t xml:space="preserve">a exigência adicional de que o agente que presta apoio seja mais competente que o solicitante, discutida na Seção 2.10, e a seleção de um único apoiador por evento, onde a formulação original admite múltiplos respondentes com ganhos acumulados.</w:t>
       </w:r>
     </w:p>
     <w:p>
@@ -810,7 +909,7 @@
           <w:sz w:val="24"/>
           <w:szCs w:val="24"/>
         </w:rPr>
-        <w:t xml:space="preserve">A saturação individual e o atrito na rede traduzem-se em multiplicadores adimensionais no intervalo [0,1], obtidos por inferência difusa — fuzzificação dos estados contínuos de fadiga e atrito por funções de pertinência, avaliação por regras e defuzzificação —, procedimento validado para representar variáveis qualitativas em Dinâmica de Sistemas (Liu, Triantis e Sarangi, 2011). A produtividade efetiva resulta da modulação da produtividade nominal por esses multiplicadores:</w:t>
+        <w:t xml:space="preserve">A saturação individual e o atrito na rede traduzem-se em multiplicadores adimensionais no intervalo [0,1], obtidos por inferência difusa — fuzzificação dos estados contínuos de fadiga e atrito por funções de pertinência, avaliação por regras e defuzzificação —, procedimento proposto e ilustrado por Liu, Triantis e Sarangi (2011) para representar variáveis qualitativas em Dinâmica de Sistemas. Registre-se que os autores propõem e demonstram o método em aplicação, sem estabelecer validação geral dele; a adoção aqui é, portanto, de um procedimento proposto na literatura, e não de um procedimento validado. A produtividade efetiva resulta da modulação da produtividade nominal por esses multiplicadores:</w:t>
       </w:r>
     </w:p>
     <w:p>
@@ -952,7 +1051,7 @@
           <w:sz w:val="24"/>
           <w:szCs w:val="24"/>
         </w:rPr>
-        <w:t xml:space="preserve">A métrica terminal condensa a ociosidade da rede e a penalidade do satisficing num índice de eficiência total do esforço, razão entre o tempo de trabalho efetivo e o tempo total consumido:</w:t>
+        <w:t xml:space="preserve">A métrica terminal agrega os quatro relógios do projeto na fração do esforço contabilizado que corresponde a trabalho produtivo, razão entre o tempo de trabalho efetivo e a soma dos quatro relógios:</w:t>
       </w:r>
     </w:p>
     <w:p>
@@ -1080,7 +1179,7 @@
           <w:sz w:val="20"/>
           <w:szCs w:val="20"/>
         </w:rPr>
-        <w:t xml:space="preserve">  — tempo de retrabalho decorrente de falhas detectadas.</w:t>
+        <w:t xml:space="preserve">  — esforço de retrabalho contabilizado, decorrente de falhas detectadas. Não ocupa agente nem avança o cronograma na implementação atual (ver Seção 2.8).</w:t>
       </w:r>
     </w:p>
     <w:p>
@@ -3195,7 +3294,7 @@
           <w:sz w:val="24"/>
           <w:szCs w:val="24"/>
         </w:rPr>
-        <w:t xml:space="preserve">O corte em três desvios não é escolha deste trabalho. Pela desigualdade de Vysochanskii–Petunin, para qualquer distribuição unimodal ao menos noventa e cinco por cento da massa de probabilidade situa-se a menos de três desvios da média, de modo que descartar valores com implausibilidade superior a três raramente descarta o vetor verdadeiro (PUKELSHEIM, 1994).</w:t>
+        <w:t xml:space="preserve">O corte em três desvios não é escolha deste trabalho. Pela desigualdade de Vysochanskii–Petunin, para distribuições unimodais dotadas de densidade e com variância finita, ao menos noventa e cinco por cento da massa de probabilidade situa-se a menos de três desvios da média (PUKELSHEIM, 1994), de modo que descartar valores com implausibilidade superior a três raramente descarta o vetor verdadeiro. As condições do resultado são registradas porque o corte se apoia nelas: a desigualdade não vale para uma distribuição unimodal qualquer.</w:t>
       </w:r>
     </w:p>
     <w:p>
@@ -3245,7 +3344,7 @@
           <w:sz w:val="24"/>
           <w:szCs w:val="24"/>
         </w:rPr>
-        <w:t xml:space="preserve">Validação por gêmeo idêntico. </w:t>
+        <w:t xml:space="preserve">Teste do gêmeo idêntico. </w:t>
       </w:r>
       <w:r>
         <w:rPr>
@@ -3961,7 +4060,7 @@
           <w:sz w:val="24"/>
           <w:szCs w:val="24"/>
         </w:rPr>
-        <w:t xml:space="preserve">Os dois arranjos diferem em todos os quatro parâmetros organizacionais, e não apenas na probabilidade de reporte. Essa é uma limitação de delineamento que precisa ser declarada: um contraste que move quatro variáveis ao mesmo tempo não permite atribuir o efeito observado a nenhum mecanismo isolado. O experimento compara dois PACOTES de governança, e é assim que deve ser lido. A decomposição do efeito por parâmetro exige um ensaio de ablação, que consta do cronograma e ainda não foi executado.</w:t>
+        <w:t xml:space="preserve">Os dois arranjos diferem em todos os quatro parâmetros organizacionais, e não apenas na probabilidade de reporte. Essa é uma limitação de delineamento que precisa ser declarada: um contraste que move quatro variáveis ao mesmo tempo não permite atribuir o efeito observado a nenhum mecanismo isolado. O experimento compara dois PACOTES de governança, e é assim que deve ser lido. A decomposição do efeito exige ablação, executada e apresentada na Seção 2.9 — cujo resultado obriga a qualificar parte da leitura mecanística deste experimento.</w:t>
       </w:r>
     </w:p>
     <w:p>
@@ -4023,7 +4122,7 @@
           <w:sz w:val="24"/>
           <w:szCs w:val="24"/>
         </w:rPr>
-        <w:t xml:space="preserve">O parâmetro que distingue substantivamente os dois arranjos é a probabilidade de reporte de defeito. Ela operacionaliza a noção de segurança psicológica: em um arranjo centralizado, o agente que detecta um defeito próprio antecipa custo pessoal ao reportá-lo e tende a ocultá-lo, alimentando o estoque de dívida técnica latente; em um arranjo adaptativo, o mesmo agente reporta, e o retrabalho é pago imediatamente e de forma visível. O modelo não presume qual arranjo é superior: a diferença de desempenho, se existir, emerge da interação entre ocultação, acúmulo de dívida e pressão de prazo.</w:t>
+        <w:t xml:space="preserve">A probabilidade de reporte de defeito operacionaliza a noção de segurança psicológica: em um arranjo centralizado, o agente que detecta um defeito próprio antecipa custo pessoal ao reportá-lo e tende a ocultá-lo, alimentando o estoque de dívida técnica latente; em um arranjo adaptativo, o mesmo agente reporta, e o retrabalho é pago imediatamente e de forma visível. A relação entre segurança psicológica e disposição a reportar erros é sustentada na fase conceitual deste trabalho, que a apoia em literatura própria de comportamento organizacional. Esta entrega, porém, NÃO auditou essas fontes primárias, e elas não constam das referências aqui listadas. Em consequência, a relação é apresentada como PREMISSA DE MODELAGEM herdada da fase conceitual, e não como resultado estabelecido da literatura, e a verificação das fontes correspondentes fica registrada como pendência bibliográfica para a etapa seguinte. O que esta entrega afirma é apenas o que mediu: dado o parâmetro, como o modelo se comporta. O modelo não presume qual arranjo é superior; a diferença de desempenho emerge da interação entre ocultação, acúmulo de dívida e pressão de prazo.</w:t>
       </w:r>
     </w:p>
     <w:p>
@@ -4171,7 +4270,7 @@
           <w:sz w:val="24"/>
           <w:szCs w:val="24"/>
         </w:rPr>
-        <w:t xml:space="preserve">Os resultados apresentados no capítulo seguinte referem-se integralmente a esses dois acoplamentos. Os demais componentes do modelo — a inferência difusa que produz μ_cognitivo e μ_rede, a árvore de decisão de três portas, os estoques e a integração temporal — permanecem na especificação formal estabelecida na fase conceitual e serão implementados na etapa subsequente, conforme o cronograma da Seção 2.7.</w:t>
+        <w:t xml:space="preserve">Os resultados apresentados no capítulo seguinte referem-se integralmente a esses dois acoplamentos. Os demais componentes do modelo — a inferência difusa que produz μ_cognitivo e μ_rede, a árvore de decisão de três portas, os estoques e a integração temporal — encontram-se implementados e verificados, e são eles que produzem os resultados das Seções 2.7 a 2.11; a Seção 2.7 relaciona as verificações executadas sobre cada um.</w:t>
       </w:r>
     </w:p>
     <w:p>
@@ -4224,7 +4323,7 @@
           <w:sz w:val="24"/>
           <w:szCs w:val="24"/>
         </w:rPr>
-        <w:t xml:space="preserve">A primeira versão funcional do pipeline de dados foi concluída e validada. Os requisitos essenciais de rastreabilidade, imutabilidade e verificação automática foram atendidos. A Figura 1 apresenta a arquitetura implementada, organizada em três camadas: dados brutos imutáveis, scripts de processamento e saídas auditáveis.</w:t>
+        <w:t xml:space="preserve">A primeira versão funcional do pipeline de dados foi concluída e verificada. Os requisitos essenciais de rastreabilidade, imutabilidade e verificação automática foram atendidos. A Figura 1 apresenta a arquitetura implementada, organizada em três camadas: dados brutos imutáveis, scripts de processamento e saídas auditáveis.</w:t>
       </w:r>
     </w:p>
     <w:p>
@@ -6739,7 +6838,7 @@
           <w:sz w:val="24"/>
           <w:szCs w:val="24"/>
         </w:rPr>
-        <w:t xml:space="preserve">O resultado de maior consequência para o trabalho é negativo e foi obtido pelo teste que a metodologia previa. Isoladamente, a complexidade ciclomática apresenta associação forte com a ocorrência de defeito, mesmo controlando o projeto de origem (razão de chances 1,90 por unidade logarítmica; LR = 639,8). Contudo, ao se acrescentar o tamanho do módulo ao modelo, o efeito da complexidade desaparece: a razão de chances ajustada cai para 0,944, com intervalo de confiança de 95% entre 0,870 e 1,024 — contendo, portanto, o valor nulo — e p = 0,17. A relação inversa não se verifica: o tamanho sobrevive folgadamente ao controle pela complexidade (LR = 431,2; p ≈ 9 × 10⁻⁹⁶). A Figura 2 apresenta o mesmo teste aplicado a todas as métricas candidatas; nenhuma delas exibe efeito positivo independente do tamanho, e as que permanecem estatisticamente distinguíveis do nulo o fazem com sinal negativo, padrão característico de colinearidade e não de mecanismo causal.</w:t>
+        <w:t xml:space="preserve">O resultado de maior consequência para o trabalho é negativo e foi obtido pelo teste que a metodologia previa. Isoladamente, a complexidade ciclomática apresenta associação forte com a ocorrência de defeito, mesmo controlando o projeto de origem (razão de chances 1,90 por unidade logarítmica; LR = 639,8). Contudo, ao se acrescentar o tamanho do módulo ao modelo, o efeito da complexidade desaparece: a razão de chances ajustada cai para 0,944, com intervalo de confiança de 95% entre 0,870 e 1,024 — contendo, portanto, o valor nulo — e p = 0,17. A relação inversa não se verifica: o tamanho sobrevive folgadamente ao controle pela complexidade (LR = 431,2; p ≈ 9 × 10⁻⁹⁶). A Figura 2 apresenta o mesmo teste aplicado a todas as seis métricas candidatas. Uma delas — a complexidade de projeto — exibe efeito positivo com intervalo de confiança acima da unidade (razão de chances 1,098; IC 95% [1,010; 1,194]; p = 0,028); as demais que permanecem distinguíveis do nulo o fazem com sinal negativo, padrão característico de colinearidade e não de mecanismo causal. O efeito positivo isolado, porém, não sobrevive à correção para comparações múltiplas: as seis métricas foram testadas na mesma base, e sob o procedimento de Holm–Bonferroni o valor-p corrigido dessa métrica sobe a 0,084. NENHUMA das seis sobrevive à correção. A distinção é registrada porque a figura mostra o intervalo não corrigido: lida isoladamente, ela sugere um sobrevivente que a correção elimina.</w:t>
       </w:r>
     </w:p>
     <w:p>
@@ -6834,7 +6933,38 @@
           <w:sz w:val="24"/>
           <w:szCs w:val="24"/>
         </w:rPr>
-        <w:t xml:space="preserve">Esse resultado não invalida o uso da complexidade como eixo ordinal, mas altera o que se pode afirmar a partir dele. A ordenação do risco pelas faixas de complexidade é forte e robusta, como mostram a Figura 3 e a Tabela 3: o risco cresce monotonicamente de 0,147 a 0,439 entre a faixa mais baixa e a mais alta, a tendência é altamente significativa, e a monotonicidade se preserva sob todos os cinco esquemas alternativos de corte testados e sob todas as doze reamostragens por exclusão de projeto. O que os dados não sustentam é a atribuição causal: a complexidade ciclomática opera, nesta base, como marcador ordinal de risco correlacionado ao tamanho, e não como fator de risco independente dele. Para o propósito deste trabalho — transferência ordinal de risco entre domínios — um marcador estável é suficiente; a afirmação de efeito independente, que não seria sustentável, é explicitamente abandonada.</w:t>
+        <w:t xml:space="preserve">Esse resultado não invalida o uso da complexidade como eixo ordinal, mas altera o que se pode afirmar a partir dele. A ordenação do risco pelas faixas de complexidade é forte e robusta, como mostram a Figura 3 e a Tabela 3: o risco cresce monotonicamente de 0,147 a 0,439 entre a faixa mais baixa e a mais alta, e a monotonicidade se preserva sob todos os cinco esquemas alternativos de corte testados e sob todas as doze reamostragens por exclusão de projeto. O que os dados não sustentam é a atribuição causal: a complexidade ciclomática opera, nesta base, como marcador ordinal de risco correlacionado ao tamanho, e não como fator de risco independente dele. Para o propósito deste trabalho — transferência ordinal de risco entre domínios — um marcador estável é suficiente; a afirmação de efeito independente, que não seria sustentável, é explicitamente abandonada.</w:t>
+      </w:r>
+    </w:p>
+    <w:p>
+      <w:pPr>
+        <w:spacing w:after="120" w:line="360"/>
+        <w:ind w:firstLine="708"/>
+        <w:jc w:val="both"/>
+      </w:pPr>
+      <w:r>
+        <w:rPr>
+          <w:rFonts w:ascii="Times New Roman" w:cs="Times New Roman" w:eastAsia="Times New Roman" w:hAnsi="Times New Roman"/>
+          <w:b/>
+          <w:bCs/>
+          <w:i w:val="false"/>
+          <w:iCs w:val="false"/>
+          <w:sz w:val="24"/>
+          <w:szCs w:val="24"/>
+        </w:rPr>
+        <w:t xml:space="preserve">A força dos valores-p desta camada, e por que ela não deve ser lida ao pé da letra. </w:t>
+      </w:r>
+      <w:r>
+        <w:rPr>
+          <w:rFonts w:ascii="Times New Roman" w:cs="Times New Roman" w:eastAsia="Times New Roman" w:hAnsi="Times New Roman"/>
+          <w:b w:val="false"/>
+          <w:bCs w:val="false"/>
+          <w:i w:val="false"/>
+          <w:iCs w:val="false"/>
+          <w:sz w:val="24"/>
+          <w:szCs w:val="24"/>
+        </w:rPr>
+        <w:t xml:space="preserve">Os valores-p reportados na Tabela 3 para os modelos logísticos e para o teste de tendência são calculados sobre dezessete mil trezentos e setenta e sete módulos, tratados como observações independentes. Eles não são: os módulos estão agrupados em doze projetos, e módulos do mesmo projeto compartilham equipe, processo e período. Os modelos incluem o projeto de origem como efeito fixo, o que impede que uma associação seja atribuída a uma métrica quando puder ser explicada pela procedência da observação, mas isso trata o confundimento ENTRE projetos e não a dependência DENTRO de cada um. Em consequência, os erros-padrão estão subestimados e valores-p da ordem de dez elevado a menos cento e quarenta expressam o tamanho da base, não a força da evidência. O que sustenta a conclusão desta seção não são esses valores-p, e sim duas verificações que operam na unidade correta: a monotonicidade se preserva nas doze reamostragens por exclusão sucessiva de projeto, e os intervalos das razões de risco por faixa são obtidos por reamostragem de PROJETOS, não de módulos. A inferência com erros-padrão robustos a agrupamento fica registrada como pendência; ela não altera as estimativas pontuais, apenas a precisão declarada.</w:t>
       </w:r>
     </w:p>
     <w:p>
@@ -9590,7 +9720,7 @@
                 <w:sz w:val="18"/>
                 <w:szCs w:val="18"/>
               </w:rPr>
-              <w:t xml:space="preserve">soma dos relógios não excede o tempo de agente alocado</w:t>
+              <w:t xml:space="preserve">[construcao, poder fraco] soma dos relógios não excede o tempo de agente alocado</w:t>
             </w:r>
           </w:p>
         </w:tc>
@@ -9617,7 +9747,7 @@
                 <w:sz w:val="18"/>
                 <w:szCs w:val="18"/>
               </w:rPr>
-              <w:t xml:space="preserve">estrutural</w:t>
+              <w:t xml:space="preserve">construção</w:t>
             </w:r>
           </w:p>
         </w:tc>
@@ -9671,7 +9801,7 @@
                 <w:sz w:val="18"/>
                 <w:szCs w:val="18"/>
               </w:rPr>
-              <w:t xml:space="preserve">TR e contabilizado sem consumir agente —…</w:t>
+              <w:t xml:space="preserve">folga minima 10,7% — o teste so pega…</w:t>
             </w:r>
           </w:p>
         </w:tc>
@@ -9727,7 +9857,7 @@
                 <w:sz w:val="18"/>
                 <w:szCs w:val="18"/>
               </w:rPr>
-              <w:t xml:space="preserve">E_total - bateria - competência e multiplicadores em [0 -1]</w:t>
+              <w:t xml:space="preserve">E_total, bateria, competência e multiplicadores em [0,1]</w:t>
             </w:r>
           </w:p>
         </w:tc>
@@ -9808,7 +9938,7 @@
                 <w:sz w:val="18"/>
                 <w:szCs w:val="18"/>
               </w:rPr>
-              <w:t xml:space="preserve">nan</w:t>
+              <w:t xml:space="preserve">—</w:t>
             </w:r>
           </w:p>
         </w:tc>
@@ -10138,7 +10268,7 @@
                 <w:sz w:val="18"/>
                 <w:szCs w:val="18"/>
               </w:rPr>
-              <w:t xml:space="preserve">sem risco nem pressão - nenhuma tarefa falha</w:t>
+              <w:t xml:space="preserve">sem risco nem pressão, nenhuma tarefa falha</w:t>
             </w:r>
           </w:p>
         </w:tc>
@@ -10275,7 +10405,7 @@
                 <w:sz w:val="18"/>
                 <w:szCs w:val="18"/>
               </w:rPr>
-              <w:t xml:space="preserve">sem risco nem pressão - dívida técnica nula</w:t>
+              <w:t xml:space="preserve">sem risco nem pressão, dívida técnica nula</w:t>
             </w:r>
           </w:p>
         </w:tc>
@@ -11234,7 +11364,7 @@
                 <w:sz w:val="18"/>
                 <w:szCs w:val="18"/>
               </w:rPr>
-              <w:t xml:space="preserve">exploratória defeitos gerados crescem com a pressão</w:t>
+              <w:t xml:space="preserve">[exploratória, post hoc] defeitos gerados crescem com a pressão</w:t>
             </w:r>
           </w:p>
         </w:tc>
@@ -11371,7 +11501,7 @@
                 <w:sz w:val="18"/>
                 <w:szCs w:val="18"/>
               </w:rPr>
-              <w:t xml:space="preserve">exploratória defeitos gerados crescem com a pressão</w:t>
+              <w:t xml:space="preserve">[exploratória, post hoc] defeitos gerados crescem com a pressão</w:t>
             </w:r>
           </w:p>
         </w:tc>
@@ -11508,7 +11638,7 @@
                 <w:sz w:val="18"/>
                 <w:szCs w:val="18"/>
               </w:rPr>
-              <w:t xml:space="preserve">mediana do retrabalho na faixa [1% - 50%]</w:t>
+              <w:t xml:space="preserve">[ordem de grandeza, não validação] mediana do retrabalho na faixa [1% - 50%]</w:t>
             </w:r>
           </w:p>
         </w:tc>
@@ -13941,7 +14071,7 @@
           <w:sz w:val="20"/>
           <w:szCs w:val="20"/>
         </w:rPr>
-        <w:t xml:space="preserve">Tabela 9 – Comparação pareada entre os arranjos de governança (192 pares)</w:t>
+        <w:t xml:space="preserve">Tabela 9 – Comparação pareada entre os arranjos de governança, por instância</w:t>
       </w:r>
     </w:p>
     <w:tbl>
@@ -13957,12 +14087,13 @@
         </w:tblBorders>
       </w:tblPr>
       <w:tblGrid>
-        <w:gridCol w:w="2700"/>
-        <w:gridCol w:w="1220"/>
-        <w:gridCol w:w="1220"/>
-        <w:gridCol w:w="1120"/>
-        <w:gridCol w:w="1330"/>
-        <w:gridCol w:w="1480"/>
+        <w:gridCol w:w="2620"/>
+        <w:gridCol w:w="1180"/>
+        <w:gridCol w:w="1180"/>
+        <w:gridCol w:w="1080"/>
+        <w:gridCol w:w="1080"/>
+        <w:gridCol w:w="1160"/>
+        <w:gridCol w:w="770"/>
       </w:tblGrid>
       <w:tr>
         <w:trPr>
@@ -13970,7 +14101,7 @@
         </w:trPr>
         <w:tc>
           <w:tcPr>
-            <w:tcW w:type="dxa" w:w="2700"/>
+            <w:tcW w:type="dxa" w:w="2620"/>
             <w:shd w:fill="EFEFEC" w:color="auto" w:val="clear"/>
             <w:tcMar>
               <w:top w:type="dxa" w:w="60"/>
@@ -13998,7 +14129,7 @@
         </w:tc>
         <w:tc>
           <w:tcPr>
-            <w:tcW w:type="dxa" w:w="1220"/>
+            <w:tcW w:type="dxa" w:w="1180"/>
             <w:shd w:fill="EFEFEC" w:color="auto" w:val="clear"/>
             <w:tcMar>
               <w:top w:type="dxa" w:w="60"/>
@@ -14026,7 +14157,7 @@
         </w:tc>
         <w:tc>
           <w:tcPr>
-            <w:tcW w:type="dxa" w:w="1220"/>
+            <w:tcW w:type="dxa" w:w="1180"/>
             <w:shd w:fill="EFEFEC" w:color="auto" w:val="clear"/>
             <w:tcMar>
               <w:top w:type="dxa" w:w="60"/>
@@ -14054,7 +14185,7 @@
         </w:tc>
         <w:tc>
           <w:tcPr>
-            <w:tcW w:type="dxa" w:w="1120"/>
+            <w:tcW w:type="dxa" w:w="1080"/>
             <w:shd w:fill="EFEFEC" w:color="auto" w:val="clear"/>
             <w:tcMar>
               <w:top w:type="dxa" w:w="60"/>
@@ -14082,7 +14213,7 @@
         </w:tc>
         <w:tc>
           <w:tcPr>
-            <w:tcW w:type="dxa" w:w="1330"/>
+            <w:tcW w:type="dxa" w:w="1080"/>
             <w:shd w:fill="EFEFEC" w:color="auto" w:val="clear"/>
             <w:tcMar>
               <w:top w:type="dxa" w:w="60"/>
@@ -14110,7 +14241,7 @@
         </w:tc>
         <w:tc>
           <w:tcPr>
-            <w:tcW w:type="dxa" w:w="1480"/>
+            <w:tcW w:type="dxa" w:w="1160"/>
             <w:shd w:fill="EFEFEC" w:color="auto" w:val="clear"/>
             <w:tcMar>
               <w:top w:type="dxa" w:w="60"/>
@@ -14132,7 +14263,35 @@
                 <w:sz w:val="18"/>
                 <w:szCs w:val="18"/>
               </w:rPr>
-              <w:t xml:space="preserve">Pares favoráveis</w:t>
+              <w:t xml:space="preserve">Instâncias favor.</w:t>
+            </w:r>
+          </w:p>
+        </w:tc>
+        <w:tc>
+          <w:tcPr>
+            <w:tcW w:type="dxa" w:w="770"/>
+            <w:shd w:fill="EFEFEC" w:color="auto" w:val="clear"/>
+            <w:tcMar>
+              <w:top w:type="dxa" w:w="60"/>
+              <w:left w:type="dxa" w:w="90"/>
+              <w:bottom w:type="dxa" w:w="60"/>
+              <w:right w:type="dxa" w:w="90"/>
+            </w:tcMar>
+          </w:tcPr>
+          <w:p>
+            <w:pPr>
+              <w:spacing w:after="0" w:line="240"/>
+              <w:jc w:val="center"/>
+            </w:pPr>
+            <w:r>
+              <w:rPr>
+                <w:rFonts w:ascii="Times New Roman" w:cs="Times New Roman" w:eastAsia="Times New Roman" w:hAnsi="Times New Roman"/>
+                <w:b/>
+                <w:bCs/>
+                <w:sz w:val="18"/>
+                <w:szCs w:val="18"/>
+              </w:rPr>
+              <w:t xml:space="preserve">p</w:t>
             </w:r>
           </w:p>
         </w:tc>
@@ -14140,7 +14299,7 @@
       <w:tr>
         <w:tc>
           <w:tcPr>
-            <w:tcW w:type="dxa" w:w="2700"/>
+            <w:tcW w:type="dxa" w:w="2620"/>
             <w:tcMar>
               <w:top w:type="dxa" w:w="60"/>
               <w:left w:type="dxa" w:w="90"/>
@@ -14161,13 +14320,13 @@
                 <w:sz w:val="18"/>
                 <w:szCs w:val="18"/>
               </w:rPr>
-              <w:t xml:space="preserve">Tarefas concluídas com defeito</w:t>
-            </w:r>
-          </w:p>
-        </w:tc>
-        <w:tc>
-          <w:tcPr>
-            <w:tcW w:type="dxa" w:w="1220"/>
+              <w:t xml:space="preserve">Tarefas concluídas com defeito oculto</w:t>
+            </w:r>
+          </w:p>
+        </w:tc>
+        <w:tc>
+          <w:tcPr>
+            <w:tcW w:type="dxa" w:w="1180"/>
             <w:tcMar>
               <w:top w:type="dxa" w:w="60"/>
               <w:left w:type="dxa" w:w="90"/>
@@ -14194,7 +14353,7 @@
         </w:tc>
         <w:tc>
           <w:tcPr>
-            <w:tcW w:type="dxa" w:w="1220"/>
+            <w:tcW w:type="dxa" w:w="1180"/>
             <w:tcMar>
               <w:top w:type="dxa" w:w="60"/>
               <w:left w:type="dxa" w:w="90"/>
@@ -14221,82 +14380,109 @@
         </w:tc>
         <w:tc>
           <w:tcPr>
-            <w:tcW w:type="dxa" w:w="1120"/>
-            <w:tcMar>
-              <w:top w:type="dxa" w:w="60"/>
-              <w:left w:type="dxa" w:w="90"/>
-              <w:bottom w:type="dxa" w:w="60"/>
-              <w:right w:type="dxa" w:w="90"/>
-            </w:tcMar>
-          </w:tcPr>
-          <w:p>
-            <w:pPr>
-              <w:spacing w:after="0" w:line="240"/>
-              <w:jc w:val="center"/>
-            </w:pPr>
-            <w:r>
-              <w:rPr>
-                <w:rFonts w:ascii="Times New Roman" w:cs="Times New Roman" w:eastAsia="Times New Roman" w:hAnsi="Times New Roman"/>
-                <w:b w:val="false"/>
-                <w:bCs w:val="false"/>
-                <w:sz w:val="18"/>
-                <w:szCs w:val="18"/>
-              </w:rPr>
-              <w:t xml:space="preserve">−70,6%</w:t>
-            </w:r>
-          </w:p>
-        </w:tc>
-        <w:tc>
-          <w:tcPr>
-            <w:tcW w:type="dxa" w:w="1330"/>
-            <w:tcMar>
-              <w:top w:type="dxa" w:w="60"/>
-              <w:left w:type="dxa" w:w="90"/>
-              <w:bottom w:type="dxa" w:w="60"/>
-              <w:right w:type="dxa" w:w="90"/>
-            </w:tcMar>
-          </w:tcPr>
-          <w:p>
-            <w:pPr>
-              <w:spacing w:after="0" w:line="240"/>
-              <w:jc w:val="center"/>
-            </w:pPr>
-            <w:r>
-              <w:rPr>
-                <w:rFonts w:ascii="Times New Roman" w:cs="Times New Roman" w:eastAsia="Times New Roman" w:hAnsi="Times New Roman"/>
-                <w:b w:val="false"/>
-                <w:bCs w:val="false"/>
-                <w:sz w:val="18"/>
-                <w:szCs w:val="18"/>
-              </w:rPr>
-              <w:t xml:space="preserve">−2,400</w:t>
-            </w:r>
-          </w:p>
-        </w:tc>
-        <w:tc>
-          <w:tcPr>
-            <w:tcW w:type="dxa" w:w="1480"/>
-            <w:tcMar>
-              <w:top w:type="dxa" w:w="60"/>
-              <w:left w:type="dxa" w:w="90"/>
-              <w:bottom w:type="dxa" w:w="60"/>
-              <w:right w:type="dxa" w:w="90"/>
-            </w:tcMar>
-          </w:tcPr>
-          <w:p>
-            <w:pPr>
-              <w:spacing w:after="0" w:line="240"/>
-              <w:jc w:val="center"/>
-            </w:pPr>
-            <w:r>
-              <w:rPr>
-                <w:rFonts w:ascii="Times New Roman" w:cs="Times New Roman" w:eastAsia="Times New Roman" w:hAnsi="Times New Roman"/>
-                <w:b w:val="false"/>
-                <w:bCs w:val="false"/>
-                <w:sz w:val="18"/>
-                <w:szCs w:val="18"/>
-              </w:rPr>
-              <w:t xml:space="preserve">97,9%</w:t>
+            <w:tcW w:type="dxa" w:w="1080"/>
+            <w:tcMar>
+              <w:top w:type="dxa" w:w="60"/>
+              <w:left w:type="dxa" w:w="90"/>
+              <w:bottom w:type="dxa" w:w="60"/>
+              <w:right w:type="dxa" w:w="90"/>
+            </w:tcMar>
+          </w:tcPr>
+          <w:p>
+            <w:pPr>
+              <w:spacing w:after="0" w:line="240"/>
+              <w:jc w:val="center"/>
+            </w:pPr>
+            <w:r>
+              <w:rPr>
+                <w:rFonts w:ascii="Times New Roman" w:cs="Times New Roman" w:eastAsia="Times New Roman" w:hAnsi="Times New Roman"/>
+                <w:b w:val="false"/>
+                <w:bCs w:val="false"/>
+                <w:sz w:val="18"/>
+                <w:szCs w:val="18"/>
+              </w:rPr>
+              <w:t xml:space="preserve">-70,6%</w:t>
+            </w:r>
+          </w:p>
+        </w:tc>
+        <w:tc>
+          <w:tcPr>
+            <w:tcW w:type="dxa" w:w="1080"/>
+            <w:tcMar>
+              <w:top w:type="dxa" w:w="60"/>
+              <w:left w:type="dxa" w:w="90"/>
+              <w:bottom w:type="dxa" w:w="60"/>
+              <w:right w:type="dxa" w:w="90"/>
+            </w:tcMar>
+          </w:tcPr>
+          <w:p>
+            <w:pPr>
+              <w:spacing w:after="0" w:line="240"/>
+              <w:jc w:val="center"/>
+            </w:pPr>
+            <w:r>
+              <w:rPr>
+                <w:rFonts w:ascii="Times New Roman" w:cs="Times New Roman" w:eastAsia="Times New Roman" w:hAnsi="Times New Roman"/>
+                <w:b w:val="false"/>
+                <w:bCs w:val="false"/>
+                <w:sz w:val="18"/>
+                <w:szCs w:val="18"/>
+              </w:rPr>
+              <w:t xml:space="preserve">-7,815</w:t>
+            </w:r>
+          </w:p>
+        </w:tc>
+        <w:tc>
+          <w:tcPr>
+            <w:tcW w:type="dxa" w:w="1160"/>
+            <w:tcMar>
+              <w:top w:type="dxa" w:w="60"/>
+              <w:left w:type="dxa" w:w="90"/>
+              <w:bottom w:type="dxa" w:w="60"/>
+              <w:right w:type="dxa" w:w="90"/>
+            </w:tcMar>
+          </w:tcPr>
+          <w:p>
+            <w:pPr>
+              <w:spacing w:after="0" w:line="240"/>
+              <w:jc w:val="center"/>
+            </w:pPr>
+            <w:r>
+              <w:rPr>
+                <w:rFonts w:ascii="Times New Roman" w:cs="Times New Roman" w:eastAsia="Times New Roman" w:hAnsi="Times New Roman"/>
+                <w:b w:val="false"/>
+                <w:bCs w:val="false"/>
+                <w:sz w:val="18"/>
+                <w:szCs w:val="18"/>
+              </w:rPr>
+              <w:t xml:space="preserve">100,0%</w:t>
+            </w:r>
+          </w:p>
+        </w:tc>
+        <w:tc>
+          <w:tcPr>
+            <w:tcW w:type="dxa" w:w="770"/>
+            <w:tcMar>
+              <w:top w:type="dxa" w:w="60"/>
+              <w:left w:type="dxa" w:w="90"/>
+              <w:bottom w:type="dxa" w:w="60"/>
+              <w:right w:type="dxa" w:w="90"/>
+            </w:tcMar>
+          </w:tcPr>
+          <w:p>
+            <w:pPr>
+              <w:spacing w:after="0" w:line="240"/>
+              <w:jc w:val="center"/>
+            </w:pPr>
+            <w:r>
+              <w:rPr>
+                <w:rFonts w:ascii="Times New Roman" w:cs="Times New Roman" w:eastAsia="Times New Roman" w:hAnsi="Times New Roman"/>
+                <w:b w:val="false"/>
+                <w:bCs w:val="false"/>
+                <w:sz w:val="18"/>
+                <w:szCs w:val="18"/>
+              </w:rPr>
+              <w:t xml:space="preserve">0,00044</w:t>
             </w:r>
           </w:p>
         </w:tc>
@@ -14304,7 +14490,7 @@
       <w:tr>
         <w:tc>
           <w:tcPr>
-            <w:tcW w:type="dxa" w:w="2700"/>
+            <w:tcW w:type="dxa" w:w="2620"/>
             <w:tcMar>
               <w:top w:type="dxa" w:w="60"/>
               <w:left w:type="dxa" w:w="90"/>
@@ -14331,7 +14517,7 @@
         </w:tc>
         <w:tc>
           <w:tcPr>
-            <w:tcW w:type="dxa" w:w="1220"/>
+            <w:tcW w:type="dxa" w:w="1180"/>
             <w:tcMar>
               <w:top w:type="dxa" w:w="60"/>
               <w:left w:type="dxa" w:w="90"/>
@@ -14358,7 +14544,7 @@
         </w:tc>
         <w:tc>
           <w:tcPr>
-            <w:tcW w:type="dxa" w:w="1220"/>
+            <w:tcW w:type="dxa" w:w="1180"/>
             <w:tcMar>
               <w:top w:type="dxa" w:w="60"/>
               <w:left w:type="dxa" w:w="90"/>
@@ -14385,82 +14571,109 @@
         </w:tc>
         <w:tc>
           <w:tcPr>
-            <w:tcW w:type="dxa" w:w="1120"/>
-            <w:tcMar>
-              <w:top w:type="dxa" w:w="60"/>
-              <w:left w:type="dxa" w:w="90"/>
-              <w:bottom w:type="dxa" w:w="60"/>
-              <w:right w:type="dxa" w:w="90"/>
-            </w:tcMar>
-          </w:tcPr>
-          <w:p>
-            <w:pPr>
-              <w:spacing w:after="0" w:line="240"/>
-              <w:jc w:val="center"/>
-            </w:pPr>
-            <w:r>
-              <w:rPr>
-                <w:rFonts w:ascii="Times New Roman" w:cs="Times New Roman" w:eastAsia="Times New Roman" w:hAnsi="Times New Roman"/>
-                <w:b w:val="false"/>
-                <w:bCs w:val="false"/>
-                <w:sz w:val="18"/>
-                <w:szCs w:val="18"/>
-              </w:rPr>
-              <w:t xml:space="preserve">−70,6%</w:t>
-            </w:r>
-          </w:p>
-        </w:tc>
-        <w:tc>
-          <w:tcPr>
-            <w:tcW w:type="dxa" w:w="1330"/>
-            <w:tcMar>
-              <w:top w:type="dxa" w:w="60"/>
-              <w:left w:type="dxa" w:w="90"/>
-              <w:bottom w:type="dxa" w:w="60"/>
-              <w:right w:type="dxa" w:w="90"/>
-            </w:tcMar>
-          </w:tcPr>
-          <w:p>
-            <w:pPr>
-              <w:spacing w:after="0" w:line="240"/>
-              <w:jc w:val="center"/>
-            </w:pPr>
-            <w:r>
-              <w:rPr>
-                <w:rFonts w:ascii="Times New Roman" w:cs="Times New Roman" w:eastAsia="Times New Roman" w:hAnsi="Times New Roman"/>
-                <w:b w:val="false"/>
-                <w:bCs w:val="false"/>
-                <w:sz w:val="18"/>
-                <w:szCs w:val="18"/>
-              </w:rPr>
-              <w:t xml:space="preserve">−2,400</w:t>
-            </w:r>
-          </w:p>
-        </w:tc>
-        <w:tc>
-          <w:tcPr>
-            <w:tcW w:type="dxa" w:w="1480"/>
-            <w:tcMar>
-              <w:top w:type="dxa" w:w="60"/>
-              <w:left w:type="dxa" w:w="90"/>
-              <w:bottom w:type="dxa" w:w="60"/>
-              <w:right w:type="dxa" w:w="90"/>
-            </w:tcMar>
-          </w:tcPr>
-          <w:p>
-            <w:pPr>
-              <w:spacing w:after="0" w:line="240"/>
-              <w:jc w:val="center"/>
-            </w:pPr>
-            <w:r>
-              <w:rPr>
-                <w:rFonts w:ascii="Times New Roman" w:cs="Times New Roman" w:eastAsia="Times New Roman" w:hAnsi="Times New Roman"/>
-                <w:b w:val="false"/>
-                <w:bCs w:val="false"/>
-                <w:sz w:val="18"/>
-                <w:szCs w:val="18"/>
-              </w:rPr>
-              <w:t xml:space="preserve">97,9%</w:t>
+            <w:tcW w:type="dxa" w:w="1080"/>
+            <w:tcMar>
+              <w:top w:type="dxa" w:w="60"/>
+              <w:left w:type="dxa" w:w="90"/>
+              <w:bottom w:type="dxa" w:w="60"/>
+              <w:right w:type="dxa" w:w="90"/>
+            </w:tcMar>
+          </w:tcPr>
+          <w:p>
+            <w:pPr>
+              <w:spacing w:after="0" w:line="240"/>
+              <w:jc w:val="center"/>
+            </w:pPr>
+            <w:r>
+              <w:rPr>
+                <w:rFonts w:ascii="Times New Roman" w:cs="Times New Roman" w:eastAsia="Times New Roman" w:hAnsi="Times New Roman"/>
+                <w:b w:val="false"/>
+                <w:bCs w:val="false"/>
+                <w:sz w:val="18"/>
+                <w:szCs w:val="18"/>
+              </w:rPr>
+              <w:t xml:space="preserve">-70,6%</w:t>
+            </w:r>
+          </w:p>
+        </w:tc>
+        <w:tc>
+          <w:tcPr>
+            <w:tcW w:type="dxa" w:w="1080"/>
+            <w:tcMar>
+              <w:top w:type="dxa" w:w="60"/>
+              <w:left w:type="dxa" w:w="90"/>
+              <w:bottom w:type="dxa" w:w="60"/>
+              <w:right w:type="dxa" w:w="90"/>
+            </w:tcMar>
+          </w:tcPr>
+          <w:p>
+            <w:pPr>
+              <w:spacing w:after="0" w:line="240"/>
+              <w:jc w:val="center"/>
+            </w:pPr>
+            <w:r>
+              <w:rPr>
+                <w:rFonts w:ascii="Times New Roman" w:cs="Times New Roman" w:eastAsia="Times New Roman" w:hAnsi="Times New Roman"/>
+                <w:b w:val="false"/>
+                <w:bCs w:val="false"/>
+                <w:sz w:val="18"/>
+                <w:szCs w:val="18"/>
+              </w:rPr>
+              <w:t xml:space="preserve">-7,815</w:t>
+            </w:r>
+          </w:p>
+        </w:tc>
+        <w:tc>
+          <w:tcPr>
+            <w:tcW w:type="dxa" w:w="1160"/>
+            <w:tcMar>
+              <w:top w:type="dxa" w:w="60"/>
+              <w:left w:type="dxa" w:w="90"/>
+              <w:bottom w:type="dxa" w:w="60"/>
+              <w:right w:type="dxa" w:w="90"/>
+            </w:tcMar>
+          </w:tcPr>
+          <w:p>
+            <w:pPr>
+              <w:spacing w:after="0" w:line="240"/>
+              <w:jc w:val="center"/>
+            </w:pPr>
+            <w:r>
+              <w:rPr>
+                <w:rFonts w:ascii="Times New Roman" w:cs="Times New Roman" w:eastAsia="Times New Roman" w:hAnsi="Times New Roman"/>
+                <w:b w:val="false"/>
+                <w:bCs w:val="false"/>
+                <w:sz w:val="18"/>
+                <w:szCs w:val="18"/>
+              </w:rPr>
+              <w:t xml:space="preserve">100,0%</w:t>
+            </w:r>
+          </w:p>
+        </w:tc>
+        <w:tc>
+          <w:tcPr>
+            <w:tcW w:type="dxa" w:w="770"/>
+            <w:tcMar>
+              <w:top w:type="dxa" w:w="60"/>
+              <w:left w:type="dxa" w:w="90"/>
+              <w:bottom w:type="dxa" w:w="60"/>
+              <w:right w:type="dxa" w:w="90"/>
+            </w:tcMar>
+          </w:tcPr>
+          <w:p>
+            <w:pPr>
+              <w:spacing w:after="0" w:line="240"/>
+              <w:jc w:val="center"/>
+            </w:pPr>
+            <w:r>
+              <w:rPr>
+                <w:rFonts w:ascii="Times New Roman" w:cs="Times New Roman" w:eastAsia="Times New Roman" w:hAnsi="Times New Roman"/>
+                <w:b w:val="false"/>
+                <w:bCs w:val="false"/>
+                <w:sz w:val="18"/>
+                <w:szCs w:val="18"/>
+              </w:rPr>
+              <w:t xml:space="preserve">= piso</w:t>
             </w:r>
           </w:p>
         </w:tc>
@@ -14468,7 +14681,7 @@
       <w:tr>
         <w:tc>
           <w:tcPr>
-            <w:tcW w:type="dxa" w:w="2700"/>
+            <w:tcW w:type="dxa" w:w="2620"/>
             <w:tcMar>
               <w:top w:type="dxa" w:w="60"/>
               <w:left w:type="dxa" w:w="90"/>
@@ -14495,7 +14708,7 @@
         </w:tc>
         <w:tc>
           <w:tcPr>
-            <w:tcW w:type="dxa" w:w="1220"/>
+            <w:tcW w:type="dxa" w:w="1180"/>
             <w:tcMar>
               <w:top w:type="dxa" w:w="60"/>
               <w:left w:type="dxa" w:w="90"/>
@@ -14522,7 +14735,7 @@
         </w:tc>
         <w:tc>
           <w:tcPr>
-            <w:tcW w:type="dxa" w:w="1220"/>
+            <w:tcW w:type="dxa" w:w="1180"/>
             <w:tcMar>
               <w:top w:type="dxa" w:w="60"/>
               <w:left w:type="dxa" w:w="90"/>
@@ -14549,82 +14762,109 @@
         </w:tc>
         <w:tc>
           <w:tcPr>
-            <w:tcW w:type="dxa" w:w="1120"/>
-            <w:tcMar>
-              <w:top w:type="dxa" w:w="60"/>
-              <w:left w:type="dxa" w:w="90"/>
-              <w:bottom w:type="dxa" w:w="60"/>
-              <w:right w:type="dxa" w:w="90"/>
-            </w:tcMar>
-          </w:tcPr>
-          <w:p>
-            <w:pPr>
-              <w:spacing w:after="0" w:line="240"/>
-              <w:jc w:val="center"/>
-            </w:pPr>
-            <w:r>
-              <w:rPr>
-                <w:rFonts w:ascii="Times New Roman" w:cs="Times New Roman" w:eastAsia="Times New Roman" w:hAnsi="Times New Roman"/>
-                <w:b w:val="false"/>
-                <w:bCs w:val="false"/>
-                <w:sz w:val="18"/>
-                <w:szCs w:val="18"/>
-              </w:rPr>
-              <w:t xml:space="preserve">−72,8%</w:t>
-            </w:r>
-          </w:p>
-        </w:tc>
-        <w:tc>
-          <w:tcPr>
-            <w:tcW w:type="dxa" w:w="1330"/>
-            <w:tcMar>
-              <w:top w:type="dxa" w:w="60"/>
-              <w:left w:type="dxa" w:w="90"/>
-              <w:bottom w:type="dxa" w:w="60"/>
-              <w:right w:type="dxa" w:w="90"/>
-            </w:tcMar>
-          </w:tcPr>
-          <w:p>
-            <w:pPr>
-              <w:spacing w:after="0" w:line="240"/>
-              <w:jc w:val="center"/>
-            </w:pPr>
-            <w:r>
-              <w:rPr>
-                <w:rFonts w:ascii="Times New Roman" w:cs="Times New Roman" w:eastAsia="Times New Roman" w:hAnsi="Times New Roman"/>
-                <w:b w:val="false"/>
-                <w:bCs w:val="false"/>
-                <w:sz w:val="18"/>
-                <w:szCs w:val="18"/>
-              </w:rPr>
-              <w:t xml:space="preserve">−2,046</w:t>
-            </w:r>
-          </w:p>
-        </w:tc>
-        <w:tc>
-          <w:tcPr>
-            <w:tcW w:type="dxa" w:w="1480"/>
-            <w:tcMar>
-              <w:top w:type="dxa" w:w="60"/>
-              <w:left w:type="dxa" w:w="90"/>
-              <w:bottom w:type="dxa" w:w="60"/>
-              <w:right w:type="dxa" w:w="90"/>
-            </w:tcMar>
-          </w:tcPr>
-          <w:p>
-            <w:pPr>
-              <w:spacing w:after="0" w:line="240"/>
-              <w:jc w:val="center"/>
-            </w:pPr>
-            <w:r>
-              <w:rPr>
-                <w:rFonts w:ascii="Times New Roman" w:cs="Times New Roman" w:eastAsia="Times New Roman" w:hAnsi="Times New Roman"/>
-                <w:b w:val="false"/>
-                <w:bCs w:val="false"/>
-                <w:sz w:val="18"/>
-                <w:szCs w:val="18"/>
-              </w:rPr>
-              <w:t xml:space="preserve">98,4%</w:t>
+            <w:tcW w:type="dxa" w:w="1080"/>
+            <w:tcMar>
+              <w:top w:type="dxa" w:w="60"/>
+              <w:left w:type="dxa" w:w="90"/>
+              <w:bottom w:type="dxa" w:w="60"/>
+              <w:right w:type="dxa" w:w="90"/>
+            </w:tcMar>
+          </w:tcPr>
+          <w:p>
+            <w:pPr>
+              <w:spacing w:after="0" w:line="240"/>
+              <w:jc w:val="center"/>
+            </w:pPr>
+            <w:r>
+              <w:rPr>
+                <w:rFonts w:ascii="Times New Roman" w:cs="Times New Roman" w:eastAsia="Times New Roman" w:hAnsi="Times New Roman"/>
+                <w:b w:val="false"/>
+                <w:bCs w:val="false"/>
+                <w:sz w:val="18"/>
+                <w:szCs w:val="18"/>
+              </w:rPr>
+              <w:t xml:space="preserve">-72,8%</w:t>
+            </w:r>
+          </w:p>
+        </w:tc>
+        <w:tc>
+          <w:tcPr>
+            <w:tcW w:type="dxa" w:w="1080"/>
+            <w:tcMar>
+              <w:top w:type="dxa" w:w="60"/>
+              <w:left w:type="dxa" w:w="90"/>
+              <w:bottom w:type="dxa" w:w="60"/>
+              <w:right w:type="dxa" w:w="90"/>
+            </w:tcMar>
+          </w:tcPr>
+          <w:p>
+            <w:pPr>
+              <w:spacing w:after="0" w:line="240"/>
+              <w:jc w:val="center"/>
+            </w:pPr>
+            <w:r>
+              <w:rPr>
+                <w:rFonts w:ascii="Times New Roman" w:cs="Times New Roman" w:eastAsia="Times New Roman" w:hAnsi="Times New Roman"/>
+                <w:b w:val="false"/>
+                <w:bCs w:val="false"/>
+                <w:sz w:val="18"/>
+                <w:szCs w:val="18"/>
+              </w:rPr>
+              <w:t xml:space="preserve">-6,726</w:t>
+            </w:r>
+          </w:p>
+        </w:tc>
+        <w:tc>
+          <w:tcPr>
+            <w:tcW w:type="dxa" w:w="1160"/>
+            <w:tcMar>
+              <w:top w:type="dxa" w:w="60"/>
+              <w:left w:type="dxa" w:w="90"/>
+              <w:bottom w:type="dxa" w:w="60"/>
+              <w:right w:type="dxa" w:w="90"/>
+            </w:tcMar>
+          </w:tcPr>
+          <w:p>
+            <w:pPr>
+              <w:spacing w:after="0" w:line="240"/>
+              <w:jc w:val="center"/>
+            </w:pPr>
+            <w:r>
+              <w:rPr>
+                <w:rFonts w:ascii="Times New Roman" w:cs="Times New Roman" w:eastAsia="Times New Roman" w:hAnsi="Times New Roman"/>
+                <w:b w:val="false"/>
+                <w:bCs w:val="false"/>
+                <w:sz w:val="18"/>
+                <w:szCs w:val="18"/>
+              </w:rPr>
+              <w:t xml:space="preserve">100,0%</w:t>
+            </w:r>
+          </w:p>
+        </w:tc>
+        <w:tc>
+          <w:tcPr>
+            <w:tcW w:type="dxa" w:w="770"/>
+            <w:tcMar>
+              <w:top w:type="dxa" w:w="60"/>
+              <w:left w:type="dxa" w:w="90"/>
+              <w:bottom w:type="dxa" w:w="60"/>
+              <w:right w:type="dxa" w:w="90"/>
+            </w:tcMar>
+          </w:tcPr>
+          <w:p>
+            <w:pPr>
+              <w:spacing w:after="0" w:line="240"/>
+              <w:jc w:val="center"/>
+            </w:pPr>
+            <w:r>
+              <w:rPr>
+                <w:rFonts w:ascii="Times New Roman" w:cs="Times New Roman" w:eastAsia="Times New Roman" w:hAnsi="Times New Roman"/>
+                <w:b w:val="false"/>
+                <w:bCs w:val="false"/>
+                <w:sz w:val="18"/>
+                <w:szCs w:val="18"/>
+              </w:rPr>
+              <w:t xml:space="preserve">= piso</w:t>
             </w:r>
           </w:p>
         </w:tc>
@@ -14632,7 +14872,7 @@
       <w:tr>
         <w:tc>
           <w:tcPr>
-            <w:tcW w:type="dxa" w:w="2700"/>
+            <w:tcW w:type="dxa" w:w="2620"/>
             <w:tcMar>
               <w:top w:type="dxa" w:w="60"/>
               <w:left w:type="dxa" w:w="90"/>
@@ -14659,7 +14899,7 @@
         </w:tc>
         <w:tc>
           <w:tcPr>
-            <w:tcW w:type="dxa" w:w="1220"/>
+            <w:tcW w:type="dxa" w:w="1180"/>
             <w:tcMar>
               <w:top w:type="dxa" w:w="60"/>
               <w:left w:type="dxa" w:w="90"/>
@@ -14686,7 +14926,7 @@
         </w:tc>
         <w:tc>
           <w:tcPr>
-            <w:tcW w:type="dxa" w:w="1220"/>
+            <w:tcW w:type="dxa" w:w="1180"/>
             <w:tcMar>
               <w:top w:type="dxa" w:w="60"/>
               <w:left w:type="dxa" w:w="90"/>
@@ -14713,61 +14953,61 @@
         </w:tc>
         <w:tc>
           <w:tcPr>
-            <w:tcW w:type="dxa" w:w="1120"/>
-            <w:tcMar>
-              <w:top w:type="dxa" w:w="60"/>
-              <w:left w:type="dxa" w:w="90"/>
-              <w:bottom w:type="dxa" w:w="60"/>
-              <w:right w:type="dxa" w:w="90"/>
-            </w:tcMar>
-          </w:tcPr>
-          <w:p>
-            <w:pPr>
-              <w:spacing w:after="0" w:line="240"/>
-              <w:jc w:val="center"/>
-            </w:pPr>
-            <w:r>
-              <w:rPr>
-                <w:rFonts w:ascii="Times New Roman" w:cs="Times New Roman" w:eastAsia="Times New Roman" w:hAnsi="Times New Roman"/>
-                <w:b w:val="false"/>
-                <w:bCs w:val="false"/>
-                <w:sz w:val="18"/>
-                <w:szCs w:val="18"/>
-              </w:rPr>
-              <w:t xml:space="preserve">−36,2%</w:t>
-            </w:r>
-          </w:p>
-        </w:tc>
-        <w:tc>
-          <w:tcPr>
-            <w:tcW w:type="dxa" w:w="1330"/>
-            <w:tcMar>
-              <w:top w:type="dxa" w:w="60"/>
-              <w:left w:type="dxa" w:w="90"/>
-              <w:bottom w:type="dxa" w:w="60"/>
-              <w:right w:type="dxa" w:w="90"/>
-            </w:tcMar>
-          </w:tcPr>
-          <w:p>
-            <w:pPr>
-              <w:spacing w:after="0" w:line="240"/>
-              <w:jc w:val="center"/>
-            </w:pPr>
-            <w:r>
-              <w:rPr>
-                <w:rFonts w:ascii="Times New Roman" w:cs="Times New Roman" w:eastAsia="Times New Roman" w:hAnsi="Times New Roman"/>
-                <w:b w:val="false"/>
-                <w:bCs w:val="false"/>
-                <w:sz w:val="18"/>
-                <w:szCs w:val="18"/>
-              </w:rPr>
-              <w:t xml:space="preserve">−1,988</w:t>
-            </w:r>
-          </w:p>
-        </w:tc>
-        <w:tc>
-          <w:tcPr>
-            <w:tcW w:type="dxa" w:w="1480"/>
+            <w:tcW w:type="dxa" w:w="1080"/>
+            <w:tcMar>
+              <w:top w:type="dxa" w:w="60"/>
+              <w:left w:type="dxa" w:w="90"/>
+              <w:bottom w:type="dxa" w:w="60"/>
+              <w:right w:type="dxa" w:w="90"/>
+            </w:tcMar>
+          </w:tcPr>
+          <w:p>
+            <w:pPr>
+              <w:spacing w:after="0" w:line="240"/>
+              <w:jc w:val="center"/>
+            </w:pPr>
+            <w:r>
+              <w:rPr>
+                <w:rFonts w:ascii="Times New Roman" w:cs="Times New Roman" w:eastAsia="Times New Roman" w:hAnsi="Times New Roman"/>
+                <w:b w:val="false"/>
+                <w:bCs w:val="false"/>
+                <w:sz w:val="18"/>
+                <w:szCs w:val="18"/>
+              </w:rPr>
+              <w:t xml:space="preserve">-36,2%</w:t>
+            </w:r>
+          </w:p>
+        </w:tc>
+        <w:tc>
+          <w:tcPr>
+            <w:tcW w:type="dxa" w:w="1080"/>
+            <w:tcMar>
+              <w:top w:type="dxa" w:w="60"/>
+              <w:left w:type="dxa" w:w="90"/>
+              <w:bottom w:type="dxa" w:w="60"/>
+              <w:right w:type="dxa" w:w="90"/>
+            </w:tcMar>
+          </w:tcPr>
+          <w:p>
+            <w:pPr>
+              <w:spacing w:after="0" w:line="240"/>
+              <w:jc w:val="center"/>
+            </w:pPr>
+            <w:r>
+              <w:rPr>
+                <w:rFonts w:ascii="Times New Roman" w:cs="Times New Roman" w:eastAsia="Times New Roman" w:hAnsi="Times New Roman"/>
+                <w:b w:val="false"/>
+                <w:bCs w:val="false"/>
+                <w:sz w:val="18"/>
+                <w:szCs w:val="18"/>
+              </w:rPr>
+              <w:t xml:space="preserve">-5,546</w:t>
+            </w:r>
+          </w:p>
+        </w:tc>
+        <w:tc>
+          <w:tcPr>
+            <w:tcW w:type="dxa" w:w="1160"/>
             <w:tcMar>
               <w:top w:type="dxa" w:w="60"/>
               <w:left w:type="dxa" w:w="90"/>
@@ -14789,6 +15029,33 @@
                 <w:szCs w:val="18"/>
               </w:rPr>
               <w:t xml:space="preserve">100,0%</w:t>
+            </w:r>
+          </w:p>
+        </w:tc>
+        <w:tc>
+          <w:tcPr>
+            <w:tcW w:type="dxa" w:w="770"/>
+            <w:tcMar>
+              <w:top w:type="dxa" w:w="60"/>
+              <w:left w:type="dxa" w:w="90"/>
+              <w:bottom w:type="dxa" w:w="60"/>
+              <w:right w:type="dxa" w:w="90"/>
+            </w:tcMar>
+          </w:tcPr>
+          <w:p>
+            <w:pPr>
+              <w:spacing w:after="0" w:line="240"/>
+              <w:jc w:val="center"/>
+            </w:pPr>
+            <w:r>
+              <w:rPr>
+                <w:rFonts w:ascii="Times New Roman" w:cs="Times New Roman" w:eastAsia="Times New Roman" w:hAnsi="Times New Roman"/>
+                <w:b w:val="false"/>
+                <w:bCs w:val="false"/>
+                <w:sz w:val="18"/>
+                <w:szCs w:val="18"/>
+              </w:rPr>
+              <w:t xml:space="preserve">= piso</w:t>
             </w:r>
           </w:p>
         </w:tc>
@@ -14796,7 +15063,7 @@
       <w:tr>
         <w:tc>
           <w:tcPr>
-            <w:tcW w:type="dxa" w:w="2700"/>
+            <w:tcW w:type="dxa" w:w="2620"/>
             <w:tcMar>
               <w:top w:type="dxa" w:w="60"/>
               <w:left w:type="dxa" w:w="90"/>
@@ -14817,13 +15084,13 @@
                 <w:sz w:val="18"/>
                 <w:szCs w:val="18"/>
               </w:rPr>
-              <w:t xml:space="preserve">Ocupação E_total (fração do esforço em trabalho produtivo)</w:t>
-            </w:r>
-          </w:p>
-        </w:tc>
-        <w:tc>
-          <w:tcPr>
-            <w:tcW w:type="dxa" w:w="1220"/>
+              <w:t xml:space="preserve">Ocupação E_total</w:t>
+            </w:r>
+          </w:p>
+        </w:tc>
+        <w:tc>
+          <w:tcPr>
+            <w:tcW w:type="dxa" w:w="1180"/>
             <w:tcMar>
               <w:top w:type="dxa" w:w="60"/>
               <w:left w:type="dxa" w:w="90"/>
@@ -14850,7 +15117,7 @@
         </w:tc>
         <w:tc>
           <w:tcPr>
-            <w:tcW w:type="dxa" w:w="1220"/>
+            <w:tcW w:type="dxa" w:w="1180"/>
             <w:tcMar>
               <w:top w:type="dxa" w:w="60"/>
               <w:left w:type="dxa" w:w="90"/>
@@ -14877,82 +15144,109 @@
         </w:tc>
         <w:tc>
           <w:tcPr>
-            <w:tcW w:type="dxa" w:w="1120"/>
-            <w:tcMar>
-              <w:top w:type="dxa" w:w="60"/>
-              <w:left w:type="dxa" w:w="90"/>
-              <w:bottom w:type="dxa" w:w="60"/>
-              <w:right w:type="dxa" w:w="90"/>
-            </w:tcMar>
-          </w:tcPr>
-          <w:p>
-            <w:pPr>
-              <w:spacing w:after="0" w:line="240"/>
-              <w:jc w:val="center"/>
-            </w:pPr>
-            <w:r>
-              <w:rPr>
-                <w:rFonts w:ascii="Times New Roman" w:cs="Times New Roman" w:eastAsia="Times New Roman" w:hAnsi="Times New Roman"/>
-                <w:b w:val="false"/>
-                <w:bCs w:val="false"/>
-                <w:sz w:val="18"/>
-                <w:szCs w:val="18"/>
-              </w:rPr>
-              <w:t xml:space="preserve">+13,3%</w:t>
-            </w:r>
-          </w:p>
-        </w:tc>
-        <w:tc>
-          <w:tcPr>
-            <w:tcW w:type="dxa" w:w="1330"/>
-            <w:tcMar>
-              <w:top w:type="dxa" w:w="60"/>
-              <w:left w:type="dxa" w:w="90"/>
-              <w:bottom w:type="dxa" w:w="60"/>
-              <w:right w:type="dxa" w:w="90"/>
-            </w:tcMar>
-          </w:tcPr>
-          <w:p>
-            <w:pPr>
-              <w:spacing w:after="0" w:line="240"/>
-              <w:jc w:val="center"/>
-            </w:pPr>
-            <w:r>
-              <w:rPr>
-                <w:rFonts w:ascii="Times New Roman" w:cs="Times New Roman" w:eastAsia="Times New Roman" w:hAnsi="Times New Roman"/>
-                <w:b w:val="false"/>
-                <w:bCs w:val="false"/>
-                <w:sz w:val="18"/>
-                <w:szCs w:val="18"/>
-              </w:rPr>
-              <w:t xml:space="preserve">+1,901</w:t>
-            </w:r>
-          </w:p>
-        </w:tc>
-        <w:tc>
-          <w:tcPr>
-            <w:tcW w:type="dxa" w:w="1480"/>
-            <w:tcMar>
-              <w:top w:type="dxa" w:w="60"/>
-              <w:left w:type="dxa" w:w="90"/>
-              <w:bottom w:type="dxa" w:w="60"/>
-              <w:right w:type="dxa" w:w="90"/>
-            </w:tcMar>
-          </w:tcPr>
-          <w:p>
-            <w:pPr>
-              <w:spacing w:after="0" w:line="240"/>
-              <w:jc w:val="center"/>
-            </w:pPr>
-            <w:r>
-              <w:rPr>
-                <w:rFonts w:ascii="Times New Roman" w:cs="Times New Roman" w:eastAsia="Times New Roman" w:hAnsi="Times New Roman"/>
-                <w:b w:val="false"/>
-                <w:bCs w:val="false"/>
-                <w:sz w:val="18"/>
-                <w:szCs w:val="18"/>
-              </w:rPr>
-              <w:t xml:space="preserve">97,4%</w:t>
+            <w:tcW w:type="dxa" w:w="1080"/>
+            <w:tcMar>
+              <w:top w:type="dxa" w:w="60"/>
+              <w:left w:type="dxa" w:w="90"/>
+              <w:bottom w:type="dxa" w:w="60"/>
+              <w:right w:type="dxa" w:w="90"/>
+            </w:tcMar>
+          </w:tcPr>
+          <w:p>
+            <w:pPr>
+              <w:spacing w:after="0" w:line="240"/>
+              <w:jc w:val="center"/>
+            </w:pPr>
+            <w:r>
+              <w:rPr>
+                <w:rFonts w:ascii="Times New Roman" w:cs="Times New Roman" w:eastAsia="Times New Roman" w:hAnsi="Times New Roman"/>
+                <w:b w:val="false"/>
+                <w:bCs w:val="false"/>
+                <w:sz w:val="18"/>
+                <w:szCs w:val="18"/>
+              </w:rPr>
+              <w:t xml:space="preserve">13,3%</w:t>
+            </w:r>
+          </w:p>
+        </w:tc>
+        <w:tc>
+          <w:tcPr>
+            <w:tcW w:type="dxa" w:w="1080"/>
+            <w:tcMar>
+              <w:top w:type="dxa" w:w="60"/>
+              <w:left w:type="dxa" w:w="90"/>
+              <w:bottom w:type="dxa" w:w="60"/>
+              <w:right w:type="dxa" w:w="90"/>
+            </w:tcMar>
+          </w:tcPr>
+          <w:p>
+            <w:pPr>
+              <w:spacing w:after="0" w:line="240"/>
+              <w:jc w:val="center"/>
+            </w:pPr>
+            <w:r>
+              <w:rPr>
+                <w:rFonts w:ascii="Times New Roman" w:cs="Times New Roman" w:eastAsia="Times New Roman" w:hAnsi="Times New Roman"/>
+                <w:b w:val="false"/>
+                <w:bCs w:val="false"/>
+                <w:sz w:val="18"/>
+                <w:szCs w:val="18"/>
+              </w:rPr>
+              <w:t xml:space="preserve">3,752</w:t>
+            </w:r>
+          </w:p>
+        </w:tc>
+        <w:tc>
+          <w:tcPr>
+            <w:tcW w:type="dxa" w:w="1160"/>
+            <w:tcMar>
+              <w:top w:type="dxa" w:w="60"/>
+              <w:left w:type="dxa" w:w="90"/>
+              <w:bottom w:type="dxa" w:w="60"/>
+              <w:right w:type="dxa" w:w="90"/>
+            </w:tcMar>
+          </w:tcPr>
+          <w:p>
+            <w:pPr>
+              <w:spacing w:after="0" w:line="240"/>
+              <w:jc w:val="center"/>
+            </w:pPr>
+            <w:r>
+              <w:rPr>
+                <w:rFonts w:ascii="Times New Roman" w:cs="Times New Roman" w:eastAsia="Times New Roman" w:hAnsi="Times New Roman"/>
+                <w:b w:val="false"/>
+                <w:bCs w:val="false"/>
+                <w:sz w:val="18"/>
+                <w:szCs w:val="18"/>
+              </w:rPr>
+              <w:t xml:space="preserve">100,0%</w:t>
+            </w:r>
+          </w:p>
+        </w:tc>
+        <w:tc>
+          <w:tcPr>
+            <w:tcW w:type="dxa" w:w="770"/>
+            <w:tcMar>
+              <w:top w:type="dxa" w:w="60"/>
+              <w:left w:type="dxa" w:w="90"/>
+              <w:bottom w:type="dxa" w:w="60"/>
+              <w:right w:type="dxa" w:w="90"/>
+            </w:tcMar>
+          </w:tcPr>
+          <w:p>
+            <w:pPr>
+              <w:spacing w:after="0" w:line="240"/>
+              <w:jc w:val="center"/>
+            </w:pPr>
+            <w:r>
+              <w:rPr>
+                <w:rFonts w:ascii="Times New Roman" w:cs="Times New Roman" w:eastAsia="Times New Roman" w:hAnsi="Times New Roman"/>
+                <w:b w:val="false"/>
+                <w:bCs w:val="false"/>
+                <w:sz w:val="18"/>
+                <w:szCs w:val="18"/>
+              </w:rPr>
+              <w:t xml:space="preserve">= piso</w:t>
             </w:r>
           </w:p>
         </w:tc>
@@ -14960,7 +15254,7 @@
       <w:tr>
         <w:tc>
           <w:tcPr>
-            <w:tcW w:type="dxa" w:w="2700"/>
+            <w:tcW w:type="dxa" w:w="2620"/>
             <w:tcMar>
               <w:top w:type="dxa" w:w="60"/>
               <w:left w:type="dxa" w:w="90"/>
@@ -14981,13 +15275,13 @@
                 <w:sz w:val="18"/>
                 <w:szCs w:val="18"/>
               </w:rPr>
-              <w:t xml:space="preserve">Retrabalho pago sobre o plano</w:t>
-            </w:r>
-          </w:p>
-        </w:tc>
-        <w:tc>
-          <w:tcPr>
-            <w:tcW w:type="dxa" w:w="1220"/>
+              <w:t xml:space="preserve">Esforço de retrabalho sobre o plano</w:t>
+            </w:r>
+          </w:p>
+        </w:tc>
+        <w:tc>
+          <w:tcPr>
+            <w:tcW w:type="dxa" w:w="1180"/>
             <w:tcMar>
               <w:top w:type="dxa" w:w="60"/>
               <w:left w:type="dxa" w:w="90"/>
@@ -15014,7 +15308,7 @@
         </w:tc>
         <w:tc>
           <w:tcPr>
-            <w:tcW w:type="dxa" w:w="1220"/>
+            <w:tcW w:type="dxa" w:w="1180"/>
             <w:tcMar>
               <w:top w:type="dxa" w:w="60"/>
               <w:left w:type="dxa" w:w="90"/>
@@ -15041,82 +15335,109 @@
         </w:tc>
         <w:tc>
           <w:tcPr>
-            <w:tcW w:type="dxa" w:w="1120"/>
-            <w:tcMar>
-              <w:top w:type="dxa" w:w="60"/>
-              <w:left w:type="dxa" w:w="90"/>
-              <w:bottom w:type="dxa" w:w="60"/>
-              <w:right w:type="dxa" w:w="90"/>
-            </w:tcMar>
-          </w:tcPr>
-          <w:p>
-            <w:pPr>
-              <w:spacing w:after="0" w:line="240"/>
-              <w:jc w:val="center"/>
-            </w:pPr>
-            <w:r>
-              <w:rPr>
-                <w:rFonts w:ascii="Times New Roman" w:cs="Times New Roman" w:eastAsia="Times New Roman" w:hAnsi="Times New Roman"/>
-                <w:b w:val="false"/>
-                <w:bCs w:val="false"/>
-                <w:sz w:val="18"/>
-                <w:szCs w:val="18"/>
-              </w:rPr>
-              <w:t xml:space="preserve">−23,9%</w:t>
-            </w:r>
-          </w:p>
-        </w:tc>
-        <w:tc>
-          <w:tcPr>
-            <w:tcW w:type="dxa" w:w="1330"/>
-            <w:tcMar>
-              <w:top w:type="dxa" w:w="60"/>
-              <w:left w:type="dxa" w:w="90"/>
-              <w:bottom w:type="dxa" w:w="60"/>
-              <w:right w:type="dxa" w:w="90"/>
-            </w:tcMar>
-          </w:tcPr>
-          <w:p>
-            <w:pPr>
-              <w:spacing w:after="0" w:line="240"/>
-              <w:jc w:val="center"/>
-            </w:pPr>
-            <w:r>
-              <w:rPr>
-                <w:rFonts w:ascii="Times New Roman" w:cs="Times New Roman" w:eastAsia="Times New Roman" w:hAnsi="Times New Roman"/>
-                <w:b w:val="false"/>
-                <w:bCs w:val="false"/>
-                <w:sz w:val="18"/>
-                <w:szCs w:val="18"/>
-              </w:rPr>
-              <w:t xml:space="preserve">−0,729</w:t>
-            </w:r>
-          </w:p>
-        </w:tc>
-        <w:tc>
-          <w:tcPr>
-            <w:tcW w:type="dxa" w:w="1480"/>
-            <w:tcMar>
-              <w:top w:type="dxa" w:w="60"/>
-              <w:left w:type="dxa" w:w="90"/>
-              <w:bottom w:type="dxa" w:w="60"/>
-              <w:right w:type="dxa" w:w="90"/>
-            </w:tcMar>
-          </w:tcPr>
-          <w:p>
-            <w:pPr>
-              <w:spacing w:after="0" w:line="240"/>
-              <w:jc w:val="center"/>
-            </w:pPr>
-            <w:r>
-              <w:rPr>
-                <w:rFonts w:ascii="Times New Roman" w:cs="Times New Roman" w:eastAsia="Times New Roman" w:hAnsi="Times New Roman"/>
-                <w:b w:val="false"/>
-                <w:bCs w:val="false"/>
-                <w:sz w:val="18"/>
-                <w:szCs w:val="18"/>
-              </w:rPr>
-              <w:t xml:space="preserve">77,1%</w:t>
+            <w:tcW w:type="dxa" w:w="1080"/>
+            <w:tcMar>
+              <w:top w:type="dxa" w:w="60"/>
+              <w:left w:type="dxa" w:w="90"/>
+              <w:bottom w:type="dxa" w:w="60"/>
+              <w:right w:type="dxa" w:w="90"/>
+            </w:tcMar>
+          </w:tcPr>
+          <w:p>
+            <w:pPr>
+              <w:spacing w:after="0" w:line="240"/>
+              <w:jc w:val="center"/>
+            </w:pPr>
+            <w:r>
+              <w:rPr>
+                <w:rFonts w:ascii="Times New Roman" w:cs="Times New Roman" w:eastAsia="Times New Roman" w:hAnsi="Times New Roman"/>
+                <w:b w:val="false"/>
+                <w:bCs w:val="false"/>
+                <w:sz w:val="18"/>
+                <w:szCs w:val="18"/>
+              </w:rPr>
+              <w:t xml:space="preserve">-23,9%</w:t>
+            </w:r>
+          </w:p>
+        </w:tc>
+        <w:tc>
+          <w:tcPr>
+            <w:tcW w:type="dxa" w:w="1080"/>
+            <w:tcMar>
+              <w:top w:type="dxa" w:w="60"/>
+              <w:left w:type="dxa" w:w="90"/>
+              <w:bottom w:type="dxa" w:w="60"/>
+              <w:right w:type="dxa" w:w="90"/>
+            </w:tcMar>
+          </w:tcPr>
+          <w:p>
+            <w:pPr>
+              <w:spacing w:after="0" w:line="240"/>
+              <w:jc w:val="center"/>
+            </w:pPr>
+            <w:r>
+              <w:rPr>
+                <w:rFonts w:ascii="Times New Roman" w:cs="Times New Roman" w:eastAsia="Times New Roman" w:hAnsi="Times New Roman"/>
+                <w:b w:val="false"/>
+                <w:bCs w:val="false"/>
+                <w:sz w:val="18"/>
+                <w:szCs w:val="18"/>
+              </w:rPr>
+              <w:t xml:space="preserve">-3,074</w:t>
+            </w:r>
+          </w:p>
+        </w:tc>
+        <w:tc>
+          <w:tcPr>
+            <w:tcW w:type="dxa" w:w="1160"/>
+            <w:tcMar>
+              <w:top w:type="dxa" w:w="60"/>
+              <w:left w:type="dxa" w:w="90"/>
+              <w:bottom w:type="dxa" w:w="60"/>
+              <w:right w:type="dxa" w:w="90"/>
+            </w:tcMar>
+          </w:tcPr>
+          <w:p>
+            <w:pPr>
+              <w:spacing w:after="0" w:line="240"/>
+              <w:jc w:val="center"/>
+            </w:pPr>
+            <w:r>
+              <w:rPr>
+                <w:rFonts w:ascii="Times New Roman" w:cs="Times New Roman" w:eastAsia="Times New Roman" w:hAnsi="Times New Roman"/>
+                <w:b w:val="false"/>
+                <w:bCs w:val="false"/>
+                <w:sz w:val="18"/>
+                <w:szCs w:val="18"/>
+              </w:rPr>
+              <w:t xml:space="preserve">100,0%</w:t>
+            </w:r>
+          </w:p>
+        </w:tc>
+        <w:tc>
+          <w:tcPr>
+            <w:tcW w:type="dxa" w:w="770"/>
+            <w:tcMar>
+              <w:top w:type="dxa" w:w="60"/>
+              <w:left w:type="dxa" w:w="90"/>
+              <w:bottom w:type="dxa" w:w="60"/>
+              <w:right w:type="dxa" w:w="90"/>
+            </w:tcMar>
+          </w:tcPr>
+          <w:p>
+            <w:pPr>
+              <w:spacing w:after="0" w:line="240"/>
+              <w:jc w:val="center"/>
+            </w:pPr>
+            <w:r>
+              <w:rPr>
+                <w:rFonts w:ascii="Times New Roman" w:cs="Times New Roman" w:eastAsia="Times New Roman" w:hAnsi="Times New Roman"/>
+                <w:b w:val="false"/>
+                <w:bCs w:val="false"/>
+                <w:sz w:val="18"/>
+                <w:szCs w:val="18"/>
+              </w:rPr>
+              <w:t xml:space="preserve">= piso</w:t>
             </w:r>
           </w:p>
         </w:tc>
@@ -15124,7 +15445,7 @@
       <w:tr>
         <w:tc>
           <w:tcPr>
-            <w:tcW w:type="dxa" w:w="2700"/>
+            <w:tcW w:type="dxa" w:w="2620"/>
             <w:tcMar>
               <w:top w:type="dxa" w:w="60"/>
               <w:left w:type="dxa" w:w="90"/>
@@ -15151,7 +15472,7 @@
         </w:tc>
         <w:tc>
           <w:tcPr>
-            <w:tcW w:type="dxa" w:w="1220"/>
+            <w:tcW w:type="dxa" w:w="1180"/>
             <w:tcMar>
               <w:top w:type="dxa" w:w="60"/>
               <w:left w:type="dxa" w:w="90"/>
@@ -15178,7 +15499,7 @@
         </w:tc>
         <w:tc>
           <w:tcPr>
-            <w:tcW w:type="dxa" w:w="1220"/>
+            <w:tcW w:type="dxa" w:w="1180"/>
             <w:tcMar>
               <w:top w:type="dxa" w:w="60"/>
               <w:left w:type="dxa" w:w="90"/>
@@ -15205,82 +15526,109 @@
         </w:tc>
         <w:tc>
           <w:tcPr>
-            <w:tcW w:type="dxa" w:w="1120"/>
-            <w:tcMar>
-              <w:top w:type="dxa" w:w="60"/>
-              <w:left w:type="dxa" w:w="90"/>
-              <w:bottom w:type="dxa" w:w="60"/>
-              <w:right w:type="dxa" w:w="90"/>
-            </w:tcMar>
-          </w:tcPr>
-          <w:p>
-            <w:pPr>
-              <w:spacing w:after="0" w:line="240"/>
-              <w:jc w:val="center"/>
-            </w:pPr>
-            <w:r>
-              <w:rPr>
-                <w:rFonts w:ascii="Times New Roman" w:cs="Times New Roman" w:eastAsia="Times New Roman" w:hAnsi="Times New Roman"/>
-                <w:b w:val="false"/>
-                <w:bCs w:val="false"/>
-                <w:sz w:val="18"/>
-                <w:szCs w:val="18"/>
-              </w:rPr>
-              <w:t xml:space="preserve">+9,9%</w:t>
-            </w:r>
-          </w:p>
-        </w:tc>
-        <w:tc>
-          <w:tcPr>
-            <w:tcW w:type="dxa" w:w="1330"/>
-            <w:tcMar>
-              <w:top w:type="dxa" w:w="60"/>
-              <w:left w:type="dxa" w:w="90"/>
-              <w:bottom w:type="dxa" w:w="60"/>
-              <w:right w:type="dxa" w:w="90"/>
-            </w:tcMar>
-          </w:tcPr>
-          <w:p>
-            <w:pPr>
-              <w:spacing w:after="0" w:line="240"/>
-              <w:jc w:val="center"/>
-            </w:pPr>
-            <w:r>
-              <w:rPr>
-                <w:rFonts w:ascii="Times New Roman" w:cs="Times New Roman" w:eastAsia="Times New Roman" w:hAnsi="Times New Roman"/>
-                <w:b w:val="false"/>
-                <w:bCs w:val="false"/>
-                <w:sz w:val="18"/>
-                <w:szCs w:val="18"/>
-              </w:rPr>
-              <w:t xml:space="preserve">+0,288</w:t>
-            </w:r>
-          </w:p>
-        </w:tc>
-        <w:tc>
-          <w:tcPr>
-            <w:tcW w:type="dxa" w:w="1480"/>
-            <w:tcMar>
-              <w:top w:type="dxa" w:w="60"/>
-              <w:left w:type="dxa" w:w="90"/>
-              <w:bottom w:type="dxa" w:w="60"/>
-              <w:right w:type="dxa" w:w="90"/>
-            </w:tcMar>
-          </w:tcPr>
-          <w:p>
-            <w:pPr>
-              <w:spacing w:after="0" w:line="240"/>
-              <w:jc w:val="center"/>
-            </w:pPr>
-            <w:r>
-              <w:rPr>
-                <w:rFonts w:ascii="Times New Roman" w:cs="Times New Roman" w:eastAsia="Times New Roman" w:hAnsi="Times New Roman"/>
-                <w:b w:val="false"/>
-                <w:bCs w:val="false"/>
-                <w:sz w:val="18"/>
-                <w:szCs w:val="18"/>
-              </w:rPr>
-              <w:t xml:space="preserve">39,6%</w:t>
+            <w:tcW w:type="dxa" w:w="1080"/>
+            <w:tcMar>
+              <w:top w:type="dxa" w:w="60"/>
+              <w:left w:type="dxa" w:w="90"/>
+              <w:bottom w:type="dxa" w:w="60"/>
+              <w:right w:type="dxa" w:w="90"/>
+            </w:tcMar>
+          </w:tcPr>
+          <w:p>
+            <w:pPr>
+              <w:spacing w:after="0" w:line="240"/>
+              <w:jc w:val="center"/>
+            </w:pPr>
+            <w:r>
+              <w:rPr>
+                <w:rFonts w:ascii="Times New Roman" w:cs="Times New Roman" w:eastAsia="Times New Roman" w:hAnsi="Times New Roman"/>
+                <w:b w:val="false"/>
+                <w:bCs w:val="false"/>
+                <w:sz w:val="18"/>
+                <w:szCs w:val="18"/>
+              </w:rPr>
+              <w:t xml:space="preserve">9,9%</w:t>
+            </w:r>
+          </w:p>
+        </w:tc>
+        <w:tc>
+          <w:tcPr>
+            <w:tcW w:type="dxa" w:w="1080"/>
+            <w:tcMar>
+              <w:top w:type="dxa" w:w="60"/>
+              <w:left w:type="dxa" w:w="90"/>
+              <w:bottom w:type="dxa" w:w="60"/>
+              <w:right w:type="dxa" w:w="90"/>
+            </w:tcMar>
+          </w:tcPr>
+          <w:p>
+            <w:pPr>
+              <w:spacing w:after="0" w:line="240"/>
+              <w:jc w:val="center"/>
+            </w:pPr>
+            <w:r>
+              <w:rPr>
+                <w:rFonts w:ascii="Times New Roman" w:cs="Times New Roman" w:eastAsia="Times New Roman" w:hAnsi="Times New Roman"/>
+                <w:b w:val="false"/>
+                <w:bCs w:val="false"/>
+                <w:sz w:val="18"/>
+                <w:szCs w:val="18"/>
+              </w:rPr>
+              <w:t xml:space="preserve">1,285</w:t>
+            </w:r>
+          </w:p>
+        </w:tc>
+        <w:tc>
+          <w:tcPr>
+            <w:tcW w:type="dxa" w:w="1160"/>
+            <w:tcMar>
+              <w:top w:type="dxa" w:w="60"/>
+              <w:left w:type="dxa" w:w="90"/>
+              <w:bottom w:type="dxa" w:w="60"/>
+              <w:right w:type="dxa" w:w="90"/>
+            </w:tcMar>
+          </w:tcPr>
+          <w:p>
+            <w:pPr>
+              <w:spacing w:after="0" w:line="240"/>
+              <w:jc w:val="center"/>
+            </w:pPr>
+            <w:r>
+              <w:rPr>
+                <w:rFonts w:ascii="Times New Roman" w:cs="Times New Roman" w:eastAsia="Times New Roman" w:hAnsi="Times New Roman"/>
+                <w:b w:val="false"/>
+                <w:bCs w:val="false"/>
+                <w:sz w:val="18"/>
+                <w:szCs w:val="18"/>
+              </w:rPr>
+              <w:t xml:space="preserve">6,2%</w:t>
+            </w:r>
+          </w:p>
+        </w:tc>
+        <w:tc>
+          <w:tcPr>
+            <w:tcW w:type="dxa" w:w="770"/>
+            <w:tcMar>
+              <w:top w:type="dxa" w:w="60"/>
+              <w:left w:type="dxa" w:w="90"/>
+              <w:bottom w:type="dxa" w:w="60"/>
+              <w:right w:type="dxa" w:w="90"/>
+            </w:tcMar>
+          </w:tcPr>
+          <w:p>
+            <w:pPr>
+              <w:spacing w:after="0" w:line="240"/>
+              <w:jc w:val="center"/>
+            </w:pPr>
+            <w:r>
+              <w:rPr>
+                <w:rFonts w:ascii="Times New Roman" w:cs="Times New Roman" w:eastAsia="Times New Roman" w:hAnsi="Times New Roman"/>
+                <w:b w:val="false"/>
+                <w:bCs w:val="false"/>
+                <w:sz w:val="18"/>
+                <w:szCs w:val="18"/>
+              </w:rPr>
+              <w:t xml:space="preserve">0,00009</w:t>
             </w:r>
           </w:p>
         </w:tc>
@@ -15297,7 +15645,150 @@
           <w:sz w:val="20"/>
           <w:szCs w:val="20"/>
         </w:rPr>
-        <w:t xml:space="preserve">Fonte: Dados da pesquisa (2026). A última linha é métrica de diagnóstico, discutida adiante. Os valores-p do teste de Wilcoxon não são reportados nesta tabela porque a unidade de pareamento adotada é a combinação de instância e semente — ver a ressalva de pseudorreplicação a seguir.</w:t>
+        <w:t xml:space="preserve">Fonte: Dados da pesquisa (2026). Dezesseis instâncias, cada uma com a média das suas doze sementes. “= piso” indica que o valor-p atingiu 3,05 × 10⁻⁵, o menor possível com dezesseis pares. A última linha é métrica de diagnóstico, discutida adiante.</w:t>
+      </w:r>
+    </w:p>
+    <w:p>
+      <w:pPr>
+        <w:spacing w:after="120" w:line="360"/>
+        <w:ind w:firstLine="708"/>
+        <w:jc w:val="both"/>
+      </w:pPr>
+      <w:r>
+        <w:rPr>
+          <w:rFonts w:ascii="Times New Roman" w:cs="Times New Roman" w:eastAsia="Times New Roman" w:hAnsi="Times New Roman"/>
+          <w:b/>
+          <w:bCs/>
+          <w:i w:val="false"/>
+          <w:iCs w:val="false"/>
+          <w:sz w:val="24"/>
+          <w:szCs w:val="24"/>
+        </w:rPr>
+        <w:t xml:space="preserve">O atraso depende da definição de conclusão. </w:t>
+      </w:r>
+      <w:r>
+        <w:rPr>
+          <w:rFonts w:ascii="Times New Roman" w:cs="Times New Roman" w:eastAsia="Times New Roman" w:hAnsi="Times New Roman"/>
+          <w:b w:val="false"/>
+          <w:bCs w:val="false"/>
+          <w:i w:val="false"/>
+          <w:iCs w:val="false"/>
+          <w:sz w:val="24"/>
+          <w:szCs w:val="24"/>
+        </w:rPr>
+        <w:t xml:space="preserve">O laço de simulação só encerra quando, além de todas as tarefas concluídas, a dívida oculta pendente foi integralmente detectada. O makespan aqui reportado inclui, portanto, uma cauda posterior à conclusão da última tarefa, durante a qual nenhuma tarefa está ativa e o projeto apenas aguarda que a dívida aflore. Essa cauda é maior no arranjo centralizado, que acumula mais dívida oculta e a detecta com probabilidade menor. Em consequência, a magnitude do contraste de atraso é condicionada à definição operacional de conclusão adotada, e não é independente dela: medido até a conclusão da última tarefa, e não até a quitação da dívida, o contraste seria menor. As duas definições são legítimas e medem coisas diferentes — prazo até entregar e prazo até estabilizar —, e apenas a segunda está implementada. Quantificar a alternativa exige alterar a condição de parada, o que não foi feito nesta entrega; a comparação entre as duas medidas está registrada como pendência. O sinal do efeito não está em questão: o arranjo adaptativo conclui antes sob a definição adotada, e a cauda que a definição acrescenta é maior justamente no arranjo que já era o mais lento.</w:t>
+      </w:r>
+    </w:p>
+    <w:p>
+      <w:pPr>
+        <w:spacing w:after="120" w:line="360"/>
+        <w:ind w:firstLine="708"/>
+        <w:jc w:val="both"/>
+      </w:pPr>
+      <w:r>
+        <w:rPr>
+          <w:rFonts w:ascii="Times New Roman" w:cs="Times New Roman" w:eastAsia="Times New Roman" w:hAnsi="Times New Roman"/>
+          <w:b w:val="false"/>
+          <w:bCs w:val="false"/>
+          <w:i w:val="false"/>
+          <w:iCs w:val="false"/>
+          <w:sz w:val="24"/>
+          <w:szCs w:val="24"/>
+        </w:rPr>
+        <w:t xml:space="preserve">O arranjo adaptativo supera o centralizado em todos os indicadores substantivos, em dezesseis de dezesseis instâncias, com tamanhos de efeito grandes. A leitura mecanística — a de que o arranjo adaptativo, ao converter defeito oculto em retrabalho visível e imediato, impede o acúmulo de dívida técnica que no arranjo centralizado retorna adiante sob pressão de prazo — é compatível com estes números, mas não decorre deles: os dois arranjos diferem em quatro parâmetros ao mesmo tempo, e enquanto variarem juntos a comparação mede o pacote e não um mecanismo. A Seção 2.9 executa a ablação que separa as parcelas, e o resultado obriga a qualificar parte desta leitura.</w:t>
+      </w:r>
+    </w:p>
+    <w:p>
+      <w:pPr>
+        <w:spacing w:after="120" w:line="360"/>
+        <w:ind w:firstLine="708"/>
+        <w:jc w:val="both"/>
+      </w:pPr>
+      <w:r>
+        <w:rPr>
+          <w:rFonts w:ascii="Times New Roman" w:cs="Times New Roman" w:eastAsia="Times New Roman" w:hAnsi="Times New Roman"/>
+          <w:b/>
+          <w:bCs/>
+          <w:i w:val="false"/>
+          <w:iCs w:val="false"/>
+          <w:sz w:val="24"/>
+          <w:szCs w:val="24"/>
+        </w:rPr>
+        <w:t xml:space="preserve">A unidade de inferência é a instância, e não a semente. </w:t>
+      </w:r>
+      <w:r>
+        <w:rPr>
+          <w:rFonts w:ascii="Times New Roman" w:cs="Times New Roman" w:eastAsia="Times New Roman" w:hAnsi="Times New Roman"/>
+          <w:b w:val="false"/>
+          <w:bCs w:val="false"/>
+          <w:i w:val="false"/>
+          <w:iCs w:val="false"/>
+          <w:sz w:val="24"/>
+          <w:szCs w:val="24"/>
+        </w:rPr>
+        <w:t xml:space="preserve">Uma versão anterior desta tabela pareava por combinação de instância e semente, totalizando cento e noventa e dois pares. As doze sementes de uma mesma instância não são projetos independentes: tratá-las como observações separadas é pseudorreplicação, que infla os graus de liberdade e produz valores-p sem correspondência com a informação disponível — com cento e noventa e dois pares, o menor valor-p atingível no teste de Wilcoxon é da ordem de três vezes dez elevado a menos cinquenta e oito, e nenhum valor nessa escala é interpretável. A inferência foi refeita tomando a instância como unidade, cada uma entrando com a média das suas doze sementes. As médias por braço não se alteram; alteram-se o tamanho de efeito e a proporção de casos favoráveis, que passam a ser calculados sobre a unidade correta. A correção FORTALECE o resultado: os tamanhos de efeito crescem, e a proporção de casos favoráveis ao arranjo adaptativo vai a dezesseis de dezesseis em todos os indicadores substantivos. Em contrapartida, os valores-p deixam de ser astronômicos e vários passam a coincidir com o piso de três vírgula zero cinco vezes dez elevado a menos cinco, o menor atingível com dezesseis pares; o piso informa que todos os pares apontam no mesmo sentido, e não a magnitude do efeito, que deve ser lida no tamanho de efeito e na proporção.</w:t>
+      </w:r>
+    </w:p>
+    <w:p>
+      <w:pPr>
+        <w:spacing w:after="120" w:line="360"/>
+        <w:ind w:firstLine="708"/>
+        <w:jc w:val="both"/>
+      </w:pPr>
+      <w:r>
+        <w:rPr>
+          <w:rFonts w:ascii="Times New Roman" w:cs="Times New Roman" w:eastAsia="Times New Roman" w:hAnsi="Times New Roman"/>
+          <w:b/>
+          <w:bCs/>
+          <w:i w:val="false"/>
+          <w:iCs w:val="false"/>
+          <w:sz w:val="24"/>
+          <w:szCs w:val="24"/>
+        </w:rPr>
+        <w:t xml:space="preserve">Evidência duplicada na tabela. </w:t>
+      </w:r>
+      <w:r>
+        <w:rPr>
+          <w:rFonts w:ascii="Times New Roman" w:cs="Times New Roman" w:eastAsia="Times New Roman" w:hAnsi="Times New Roman"/>
+          <w:b w:val="false"/>
+          <w:bCs w:val="false"/>
+          <w:i w:val="false"/>
+          <w:iCs w:val="false"/>
+          <w:sz w:val="24"/>
+          <w:szCs w:val="24"/>
+        </w:rPr>
+        <w:t xml:space="preserve">As duas primeiras linhas são a mesma grandeza dividida por sessenta. Os tamanhos de efeito e as proporções coincidem exatamente, e os valores-p diferem apenas pelo tratamento de empates no teste sobre valores inteiros. Mantê-las juntas faz a mesma evidência aparecer duas vezes; a supressão de uma delas está registrada como pendência de apresentação.</w:t>
+      </w:r>
+    </w:p>
+    <w:p>
+      <w:pPr>
+        <w:spacing w:after="120" w:line="360"/>
+        <w:ind w:firstLine="708"/>
+        <w:jc w:val="both"/>
+      </w:pPr>
+      <w:r>
+        <w:rPr>
+          <w:rFonts w:ascii="Times New Roman" w:cs="Times New Roman" w:eastAsia="Times New Roman" w:hAnsi="Times New Roman"/>
+          <w:b/>
+          <w:bCs/>
+          <w:i w:val="false"/>
+          <w:iCs w:val="false"/>
+          <w:sz w:val="24"/>
+          <w:szCs w:val="24"/>
+        </w:rPr>
+        <w:t xml:space="preserve">Uma métrica que media visibilidade, não dano. </w:t>
+      </w:r>
+      <w:r>
+        <w:rPr>
+          <w:rFonts w:ascii="Times New Roman" w:cs="Times New Roman" w:eastAsia="Times New Roman" w:hAnsi="Times New Roman"/>
+          <w:b w:val="false"/>
+          <w:bCs w:val="false"/>
+          <w:i w:val="false"/>
+          <w:iCs w:val="false"/>
+          <w:sz w:val="24"/>
+          <w:szCs w:val="24"/>
+        </w:rPr>
+        <w:t xml:space="preserve">A última linha da Tabela 9 move-se em sentido contrário a todas as demais. A investigação dessa discrepância revelou defeito na formulação original da métrica, e não achado substantivo. A razão entre retrabalho e esforço realizado tem por denominador o esforço efetivamente despendido, que inclui o tempo ocioso e bloqueado. O braço centralizado acumula tempo ocioso muito superior — cento e vinte e seis contra seis períodos em média — e, ao inflar o próprio denominador, dilui o retrabalho e aparenta desempenho melhor, ainda que seu retrabalho absoluto seja vinte e três vírgula oito por cento maior. A métrica premiava a ineficiência que se pretendia medir.</w:t>
       </w:r>
     </w:p>
     <w:p>
@@ -15313,7 +15804,7 @@
           <w:sz w:val="20"/>
           <w:szCs w:val="20"/>
         </w:rPr>
-        <w:t xml:space="preserve">Figura 7 – Tamanhos de efeito pareados com intervalos de confiança por reamostragem sobre os pares</w:t>
+        <w:t xml:space="preserve">Figura 7 – Composição do esforço realizado e o mesmo retrabalho medido sob duas bases distintas</w:t>
       </w:r>
     </w:p>
     <w:p>
@@ -15324,7 +15815,7 @@
       <w:r>
         <w:drawing>
           <wp:inline distT="0" distB="0" distL="0" distR="0">
-            <wp:extent cx="5219700" cy="3343275"/>
+            <wp:extent cx="5581650" cy="3086100"/>
             <wp:effectExtent t="0" r="0" b="0" l="0"/>
             <wp:docPr id="1" name="" descr="" title=""/>
             <wp:cNvGraphicFramePr>
@@ -15349,7 +15840,7 @@
                   <pic:spPr bwMode="auto">
                     <a:xfrm>
                       <a:off x="0" y="0"/>
-                      <a:ext cx="5219700" cy="3343275"/>
+                      <a:ext cx="5581650" cy="3086100"/>
                     </a:xfrm>
                     <a:prstGeom prst="rect">
                       <a:avLst/>
@@ -15385,6 +15876,18 @@
       <w:r>
         <w:rPr>
           <w:rFonts w:ascii="Times New Roman" w:cs="Times New Roman" w:eastAsia="Times New Roman" w:hAnsi="Times New Roman"/>
+          <w:b/>
+          <w:bCs/>
+          <w:i w:val="false"/>
+          <w:iCs w:val="false"/>
+          <w:sz w:val="24"/>
+          <w:szCs w:val="24"/>
+        </w:rPr>
+        <w:t xml:space="preserve">Correção adotada. </w:t>
+      </w:r>
+      <w:r>
+        <w:rPr>
+          <w:rFonts w:ascii="Times New Roman" w:cs="Times New Roman" w:eastAsia="Times New Roman" w:hAnsi="Times New Roman"/>
           <w:b w:val="false"/>
           <w:bCs w:val="false"/>
           <w:i w:val="false"/>
@@ -15392,7 +15895,26 @@
           <w:sz w:val="24"/>
           <w:szCs w:val="24"/>
         </w:rPr>
-        <w:t xml:space="preserve">O arranjo adaptativo supera o centralizado em todos os indicadores substantivos, com tamanhos de efeito grandes e intervalos de confiança que não cruzam a origem. A leitura mecanística — a de que o arranjo adaptativo, ao converter defeito oculto em retrabalho visível e imediato, impede o acúmulo de dívida técnica que no arranjo centralizado retorna adiante sob pressão de prazo — é compatível com estes números, mas não decorre deles: os dois arranjos diferem em quatro parâmetros ao mesmo tempo, e enquanto variarem juntos a comparação mede o pacote e não um mecanismo. A Seção 2.9 executa a ablação que separa as parcelas, e o resultado obriga a qualificar parte desta leitura.</w:t>
+        <w:t xml:space="preserve">A base da razão passou a ser o esforço planejado do projeto, dado pela soma das durações nominais das tarefas. Trata-se de propriedade da instância, idêntica nos dois braços, de modo que a razão só pode variar pelo numerador. A métrica agregada original foi ainda decomposta em duas: o retrabalho efetivamente pago e a dívida latente de pico. A decomposição é necessária, e não cosmética, porque os arranjos diferem justamente na probabilidade de reporte: o adaptativo converte dívida oculta em retrabalho visível, e um agregado que soma as duas parcelas não distingue conversão de redução. Com a correção, o indicador passa a favorecer o arranjo adaptativo em vinte e três vírgula nove por cento, em concordância com os demais.</w:t>
+      </w:r>
+    </w:p>
+    <w:p>
+      <w:pPr>
+        <w:spacing w:after="120" w:line="360"/>
+        <w:ind w:firstLine="708"/>
+        <w:jc w:val="both"/>
+      </w:pPr>
+      <w:r>
+        <w:rPr>
+          <w:rFonts w:ascii="Times New Roman" w:cs="Times New Roman" w:eastAsia="Times New Roman" w:hAnsi="Times New Roman"/>
+          <w:b w:val="false"/>
+          <w:bCs w:val="false"/>
+          <w:i w:val="false"/>
+          <w:iCs w:val="false"/>
+          <w:sz w:val="24"/>
+          <w:szCs w:val="24"/>
+        </w:rPr>
+        <w:t xml:space="preserve">Registra-se ainda que o valor final do estoque de dívida latente é nulo em todas as trezentas e oitenta e quatro execuções, por construção do laço de simulação, que só encerra após a quitação da dívida pendente. Por essa razão, a estatística informativa é o valor de pico do estoque, e não o seu valor terminal.</w:t>
       </w:r>
     </w:p>
     <w:p>
@@ -15411,7 +15933,7 @@
           <w:sz w:val="24"/>
           <w:szCs w:val="24"/>
         </w:rPr>
-        <w:t xml:space="preserve">Sobre a unidade de inferência. </w:t>
+        <w:t xml:space="preserve">O que TR mede, e o que não mede. </w:t>
       </w:r>
       <w:r>
         <w:rPr>
@@ -15423,38 +15945,7 @@
           <w:sz w:val="24"/>
           <w:szCs w:val="24"/>
         </w:rPr>
-        <w:t xml:space="preserve">Os pares da Tabela 9 são combinações de instância e semente. As doze sementes de uma mesma instância não são projetos independentes, e tratá-las como observações separadas é pseudorreplicação: infla o número de graus de liberdade e produz valores-p que não correspondem à quantidade de informação disponível. A refação da inferência tomando a instância como unidade está prevista para a próxima etapa. Registre-se desde já que, nas verificações desta entrega que já adotam a instância como unidade — as das Seções 2.9 e 2.10 —, o menor valor-p bilateral atingível com dezesseis instâncias é da ordem de três centésimos de milésimo, de modo que qualquer valor inferior a esse, em qualquer tabela, é artefato da unidade escolhida e não medida de evidência.</w:t>
-      </w:r>
-    </w:p>
-    <w:p>
-      <w:pPr>
-        <w:spacing w:after="120" w:line="360"/>
-        <w:ind w:firstLine="708"/>
-        <w:jc w:val="both"/>
-      </w:pPr>
-      <w:r>
-        <w:rPr>
-          <w:rFonts w:ascii="Times New Roman" w:cs="Times New Roman" w:eastAsia="Times New Roman" w:hAnsi="Times New Roman"/>
-          <w:b/>
-          <w:bCs/>
-          <w:i w:val="false"/>
-          <w:iCs w:val="false"/>
-          <w:sz w:val="24"/>
-          <w:szCs w:val="24"/>
-        </w:rPr>
-        <w:t xml:space="preserve">Uma métrica que media visibilidade, não dano. </w:t>
-      </w:r>
-      <w:r>
-        <w:rPr>
-          <w:rFonts w:ascii="Times New Roman" w:cs="Times New Roman" w:eastAsia="Times New Roman" w:hAnsi="Times New Roman"/>
-          <w:b w:val="false"/>
-          <w:bCs w:val="false"/>
-          <w:i w:val="false"/>
-          <w:iCs w:val="false"/>
-          <w:sz w:val="24"/>
-          <w:szCs w:val="24"/>
-        </w:rPr>
-        <w:t xml:space="preserve">A última linha da Tabela 9 move-se em sentido contrário a todas as demais. A investigação dessa discrepância revelou defeito na formulação original da métrica, e não achado substantivo. A razão entre retrabalho e esforço realizado tem por denominador o esforço efetivamente despendido, que inclui o tempo ocioso e bloqueado. O braço centralizado acumula tempo ocioso muito superior — cento e vinte e seis contra seis períodos em média — e, ao inflar o próprio denominador, dilui o retrabalho e aparenta desempenho melhor, ainda que seu retrabalho absoluto seja vinte e três vírgula oito por cento maior. A métrica premiava a ineficiência que se pretendia medir.</w:t>
+        <w:t xml:space="preserve">A grandeza designada TR é ESFORÇO DE RETRABALHO CONTABILIZADO, e não tempo consumido no cronograma. Quando um defeito é reportado ou aflora, a implementação atual acresce a parcela correspondente ao relógio de retrabalho, mas essa parcela não ocupa um agente nem avança o calendário do projeto do mesmo modo que a execução de uma tarefa. A denominação foi corrigida ao longo do texto para não induzir a leitura de tempo efetivamente despendido. A limitação tem duas consequências que ficam declaradas. A primeira é que o custo de cronograma do retrabalho está subestimado: no modelo atual, refazer não disputa capacidade com executar. A segunda incide sobre a métrica de ocupação, cujo denominador soma os quatro relógios e portanto inclui TR: uma parcela que não consome capacidade entra no denominador como se consumisse, de modo que a métrica não deve ser lida como medida de produtividade. Fazer o retrabalho ocupar agente e recurso é alteração estrutural do modelo, não implementada nesta entrega, e está registrada como pendência.</w:t>
       </w:r>
     </w:p>
     <w:p>
@@ -15470,7 +15961,7 @@
           <w:sz w:val="20"/>
           <w:szCs w:val="20"/>
         </w:rPr>
-        <w:t xml:space="preserve">Figura 8 – Composição do esforço realizado e o mesmo retrabalho medido sob duas bases distintas</w:t>
+        <w:t xml:space="preserve">Figura 8 – Trajetórias médias dos estoques nos dois arranjos, com faixa interquartil</w:t>
       </w:r>
     </w:p>
     <w:p>
@@ -15481,7 +15972,7 @@
       <w:r>
         <w:drawing>
           <wp:inline distT="0" distB="0" distL="0" distR="0">
-            <wp:extent cx="5581650" cy="3086100"/>
+            <wp:extent cx="5400675" cy="4029075"/>
             <wp:effectExtent t="0" r="0" b="0" l="0"/>
             <wp:docPr id="1" name="" descr="" title=""/>
             <wp:cNvGraphicFramePr>
@@ -15506,132 +15997,6 @@
                   <pic:spPr bwMode="auto">
                     <a:xfrm>
                       <a:off x="0" y="0"/>
-                      <a:ext cx="5581650" cy="3086100"/>
-                    </a:xfrm>
-                    <a:prstGeom prst="rect">
-                      <a:avLst/>
-                    </a:prstGeom>
-                  </pic:spPr>
-                </pic:pic>
-              </a:graphicData>
-            </a:graphic>
-          </wp:inline>
-        </w:drawing>
-      </w:r>
-    </w:p>
-    <w:p>
-      <w:pPr>
-        <w:spacing w:after="240" w:before="60"/>
-        <w:jc w:val="center"/>
-      </w:pPr>
-      <w:r>
-        <w:rPr>
-          <w:rFonts w:ascii="Times New Roman" w:cs="Times New Roman" w:eastAsia="Times New Roman" w:hAnsi="Times New Roman"/>
-          <w:sz w:val="20"/>
-          <w:szCs w:val="20"/>
-        </w:rPr>
-        <w:t xml:space="preserve">Fonte: Dados da pesquisa (2026).</w:t>
-      </w:r>
-    </w:p>
-    <w:p>
-      <w:pPr>
-        <w:spacing w:after="120" w:line="360"/>
-        <w:ind w:firstLine="708"/>
-        <w:jc w:val="both"/>
-      </w:pPr>
-      <w:r>
-        <w:rPr>
-          <w:rFonts w:ascii="Times New Roman" w:cs="Times New Roman" w:eastAsia="Times New Roman" w:hAnsi="Times New Roman"/>
-          <w:b/>
-          <w:bCs/>
-          <w:i w:val="false"/>
-          <w:iCs w:val="false"/>
-          <w:sz w:val="24"/>
-          <w:szCs w:val="24"/>
-        </w:rPr>
-        <w:t xml:space="preserve">Correção adotada. </w:t>
-      </w:r>
-      <w:r>
-        <w:rPr>
-          <w:rFonts w:ascii="Times New Roman" w:cs="Times New Roman" w:eastAsia="Times New Roman" w:hAnsi="Times New Roman"/>
-          <w:b w:val="false"/>
-          <w:bCs w:val="false"/>
-          <w:i w:val="false"/>
-          <w:iCs w:val="false"/>
-          <w:sz w:val="24"/>
-          <w:szCs w:val="24"/>
-        </w:rPr>
-        <w:t xml:space="preserve">A base da razão passou a ser o esforço planejado do projeto, dado pela soma das durações nominais das tarefas. Trata-se de propriedade da instância, idêntica nos dois braços, de modo que a razão só pode variar pelo numerador. A métrica agregada original foi ainda decomposta em duas: o retrabalho efetivamente pago e a dívida latente de pico. A decomposição é necessária, e não cosmética, porque os arranjos diferem justamente na probabilidade de reporte: o adaptativo converte dívida oculta em retrabalho visível, e um agregado que soma as duas parcelas não distingue conversão de redução. Com a correção, o indicador passa a favorecer o arranjo adaptativo em vinte e três vírgula nove por cento, em concordância com os demais.</w:t>
-      </w:r>
-    </w:p>
-    <w:p>
-      <w:pPr>
-        <w:spacing w:after="120" w:line="360"/>
-        <w:ind w:firstLine="708"/>
-        <w:jc w:val="both"/>
-      </w:pPr>
-      <w:r>
-        <w:rPr>
-          <w:rFonts w:ascii="Times New Roman" w:cs="Times New Roman" w:eastAsia="Times New Roman" w:hAnsi="Times New Roman"/>
-          <w:b w:val="false"/>
-          <w:bCs w:val="false"/>
-          <w:i w:val="false"/>
-          <w:iCs w:val="false"/>
-          <w:sz w:val="24"/>
-          <w:szCs w:val="24"/>
-        </w:rPr>
-        <w:t xml:space="preserve">Registra-se ainda que o valor final do estoque de dívida latente é nulo em todas as trezentas e oitenta e quatro execuções, por construção do laço de simulação, que só encerra após a quitação da dívida pendente. Por essa razão, a estatística informativa é o valor de pico do estoque, e não o seu valor terminal.</w:t>
-      </w:r>
-    </w:p>
-    <w:p>
-      <w:pPr>
-        <w:spacing w:after="60" w:before="240"/>
-        <w:jc w:val="center"/>
-      </w:pPr>
-      <w:r>
-        <w:rPr>
-          <w:rFonts w:ascii="Times New Roman" w:cs="Times New Roman" w:eastAsia="Times New Roman" w:hAnsi="Times New Roman"/>
-          <w:b/>
-          <w:bCs/>
-          <w:sz w:val="20"/>
-          <w:szCs w:val="20"/>
-        </w:rPr>
-        <w:t xml:space="preserve">Figura 9 – Trajetórias médias dos estoques nos dois arranjos, com faixa interquartil</w:t>
-      </w:r>
-    </w:p>
-    <w:p>
-      <w:pPr>
-        <w:spacing w:after="40" w:before="200"/>
-        <w:jc w:val="center"/>
-      </w:pPr>
-      <w:r>
-        <w:drawing>
-          <wp:inline distT="0" distB="0" distL="0" distR="0">
-            <wp:extent cx="5400675" cy="4029075"/>
-            <wp:effectExtent t="0" r="0" b="0" l="0"/>
-            <wp:docPr id="1" name="" descr="" title=""/>
-            <wp:cNvGraphicFramePr>
-              <a:graphicFrameLocks xmlns:a="http://schemas.openxmlformats.org/drawingml/2006/main" noChangeAspect="1"/>
-            </wp:cNvGraphicFramePr>
-            <a:graphic xmlns:a="http://schemas.openxmlformats.org/drawingml/2006/main">
-              <a:graphicData uri="http://schemas.openxmlformats.org/drawingml/2006/picture">
-                <pic:pic xmlns:pic="http://schemas.openxmlformats.org/drawingml/2006/picture">
-                  <pic:nvPicPr>
-                    <pic:cNvPr id="0" name="" descr=""/>
-                    <pic:cNvPicPr>
-                      <a:picLocks noChangeAspect="1" noChangeArrowheads="1"/>
-                    </pic:cNvPicPr>
-                  </pic:nvPicPr>
-                  <pic:blipFill>
-                    <a:blip r:embed="rId15" cstate="none"/>
-                    <a:srcRect/>
-                    <a:stretch>
-                      <a:fillRect/>
-                    </a:stretch>
-                  </pic:blipFill>
-                  <pic:spPr bwMode="auto">
-                    <a:xfrm>
-                      <a:off x="0" y="0"/>
                       <a:ext cx="5400675" cy="4029075"/>
                     </a:xfrm>
                     <a:prstGeom prst="rect">
@@ -15675,7 +16040,38 @@
           <w:sz w:val="24"/>
           <w:szCs w:val="24"/>
         </w:rPr>
-        <w:t xml:space="preserve">A Figura 9 torna visível o mecanismo. No arranjo centralizado, a dívida técnica latente cresce ao longo de todo o período nominal do projeto, atinge o máximo em torno de uma vez e meia o prazo do caminho crítico e só então é drenada, o que prolonga a execução muito além do previsto. No arranjo adaptativo, o mesmo estoque permanece próximo de zero, e o progresso validado acumula-se de forma sustentada. A bateria cognitiva média recupera-se mais cedo, o que é consequência, e não causa, do menor volume de retrabalho tardio.</w:t>
+        <w:t xml:space="preserve">A Figura 8 torna visível o mecanismo. No arranjo centralizado, a dívida técnica latente cresce ao longo de todo o período nominal do projeto, atinge o máximo em torno de uma vez e meia o prazo do caminho crítico e só então é drenada, o que prolonga a execução muito além do previsto. No arranjo adaptativo, o mesmo estoque permanece próximo de zero, e o progresso validado acumula-se de forma sustentada. A bateria cognitiva média recupera-se mais cedo, o que é consequência, e não causa, do menor volume de retrabalho tardio.</w:t>
+      </w:r>
+    </w:p>
+    <w:p>
+      <w:pPr>
+        <w:spacing w:after="120" w:line="360"/>
+        <w:ind w:firstLine="708"/>
+        <w:jc w:val="both"/>
+      </w:pPr>
+      <w:r>
+        <w:rPr>
+          <w:rFonts w:ascii="Times New Roman" w:cs="Times New Roman" w:eastAsia="Times New Roman" w:hAnsi="Times New Roman"/>
+          <w:b/>
+          <w:bCs/>
+          <w:i w:val="false"/>
+          <w:iCs w:val="false"/>
+          <w:sz w:val="24"/>
+          <w:szCs w:val="24"/>
+        </w:rPr>
+        <w:t xml:space="preserve">Comportamento no limite de pressão nula. </w:t>
+      </w:r>
+      <w:r>
+        <w:rPr>
+          <w:rFonts w:ascii="Times New Roman" w:cs="Times New Roman" w:eastAsia="Times New Roman" w:hAnsi="Times New Roman"/>
+          <w:b w:val="false"/>
+          <w:bCs w:val="false"/>
+          <w:i w:val="false"/>
+          <w:iCs w:val="false"/>
+          <w:sz w:val="24"/>
+          <w:szCs w:val="24"/>
+        </w:rPr>
+        <w:t xml:space="preserve">Registra-se um comportamento de fronteira, fora do domínio de operação. Com pressão nula o esforço cognitivo exigido zera, e a probabilidade de transição para o modo heurístico cai ao seu piso, de aproximadamente um vírgula oito por cento por período de agente. Como no arranjo centralizado a confiança constante impede toda concessão de ajuda, uma tarefa cuja dificuldade excede a competência de todos os agentes passa a depender exclusivamente desse piso para ser iniciada, o que corresponde a uma espera média da ordem de cinquenta e seis períodos por tarefa. O efeito é de lentidão severa, e não de travamento: a transição é estocástica e sua probabilidade nunca chega a zero, de modo que a execução sempre termina. O caso está fora do domínio nominal, porque a pressão é limitada inferiormente a três décimos e nunca atinge zero em nenhuma execução apresentada; e as trezentas e oitenta e quatro execuções do experimento e as duas mil oitocentas e oitenta da ablação concluíram todas dentro do horizonte. Nenhuma conclusão desta entrega depende de ignorar esse comportamento. Ele é consequência lógica da formulação atual — transição estocástica combinada com confiança constante — e desaparece assim que qualquer das duas hipóteses estruturais em avaliação for alterada.</w:t>
       </w:r>
     </w:p>
     <w:p>
@@ -16372,7 +16768,7 @@
                 <w:sz w:val="18"/>
                 <w:szCs w:val="18"/>
               </w:rPr>
-              <w:t xml:space="preserve">retrabalho pago TR</w:t>
+              <w:t xml:space="preserve">esforço de retrabalho TR</w:t>
             </w:r>
           </w:p>
         </w:tc>
@@ -20927,7 +21323,7 @@
                 <w:sz w:val="18"/>
                 <w:szCs w:val="18"/>
               </w:rPr>
-              <w:t xml:space="preserve">retrabalho pago TR</w:t>
+              <w:t xml:space="preserve">esforço de retrabalho TR</w:t>
             </w:r>
           </w:p>
         </w:tc>
@@ -23238,7 +23634,7 @@
                 <w:sz w:val="18"/>
                 <w:szCs w:val="18"/>
               </w:rPr>
-              <w:t xml:space="preserve">retrabalho pago TR</w:t>
+              <w:t xml:space="preserve">esforço de retrabalho TR</w:t>
             </w:r>
           </w:p>
         </w:tc>
@@ -24386,7 +24782,7 @@
                 <w:sz w:val="18"/>
                 <w:szCs w:val="18"/>
               </w:rPr>
-              <w:t xml:space="preserve">retrabalho pago TR</w:t>
+              <w:t xml:space="preserve">esforço de retrabalho TR</w:t>
             </w:r>
           </w:p>
         </w:tc>
@@ -24937,7 +25333,7 @@
           <w:sz w:val="24"/>
           <w:szCs w:val="24"/>
         </w:rPr>
-        <w:t xml:space="preserve">A Tabela 16 registra, para cada procedimento, as instâncias e sementes utilizadas, o número de execuções e o arquivo de saída correspondente, de modo que qualquer número apresentado possa ser reencontrado. Todas as tabelas desta seção são montadas em tempo de geração a partir desses arquivos; nenhum valor é digitado no texto.</w:t>
+        <w:t xml:space="preserve">A Tabela 14 registra, para cada procedimento, as instâncias e sementes utilizadas, o número de execuções e o arquivo de saída correspondente, de modo que qualquer número apresentado possa ser reencontrado. As tabelas das Seções 2.7 a 2.11, bem como a matriz de cenários e a tabela do experimento, são montadas em tempo de geração a partir desses arquivos, sem valor digitado. Registre-se, para não induzir generalização indevida, que as demais tabelas e os valores citados no corpo do texto das Seções 2.2 a 2.6 — a camada de dados — ainda são transcritos manualmente a partir das saídas dos scripts correspondentes. Foram conferidos contra os arquivos de origem, mas a garantia que vale para as seções derivadas de CSV não vale para eles; a extensão desse mecanismo às seções de dados está registrada como pendência.</w:t>
       </w:r>
     </w:p>
     <w:p>
@@ -24953,7 +25349,7 @@
           <w:sz w:val="20"/>
           <w:szCs w:val="20"/>
         </w:rPr>
-        <w:t xml:space="preserve">Tabela 16 – Procedimentos de verificação, condições de execução e arquivos de saída</w:t>
+        <w:t xml:space="preserve">Tabela 14 – Procedimentos de verificação, condições de execução e arquivos de saída</w:t>
       </w:r>
     </w:p>
     <w:tbl>
@@ -26146,7 +26542,7 @@
           <w:sz w:val="24"/>
           <w:szCs w:val="24"/>
         </w:rPr>
-        <w:t xml:space="preserve">A aprovação do teste, contudo, não implica que os cinco parâmetros tenham sido determinados. A Tabela 14 reporta, para cada um, a redução da largura marginal do conjunto NROY relativamente à faixa inicial.</w:t>
+        <w:t xml:space="preserve">A aprovação do teste, contudo, não implica que os cinco parâmetros tenham sido determinados. A Tabela 15 reporta, para cada um, a redução da largura marginal do conjunto NROY relativamente à faixa inicial.</w:t>
       </w:r>
     </w:p>
     <w:p>
@@ -26162,7 +26558,7 @@
           <w:sz w:val="20"/>
           <w:szCs w:val="20"/>
         </w:rPr>
-        <w:t xml:space="preserve">Tabela 14 – Identificabilidade dos parâmetros calibrados</w:t>
+        <w:t xml:space="preserve">Tabela 15 – Identificabilidade dos parâmetros calibrados</w:t>
       </w:r>
     </w:p>
     <w:tbl>
@@ -27019,7 +27415,7 @@
           <w:sz w:val="20"/>
           <w:szCs w:val="20"/>
         </w:rPr>
-        <w:t xml:space="preserve">Figura 10 – Conjunto NROY projetado sobre a crista de equifinalidade e redução marginal por parâmetro</w:t>
+        <w:t xml:space="preserve">Figura 9 – Conjunto NROY projetado sobre a crista de equifinalidade e redução marginal por parâmetro</w:t>
       </w:r>
     </w:p>
     <w:p>
@@ -27046,7 +27442,7 @@
                     </pic:cNvPicPr>
                   </pic:nvPicPr>
                   <pic:blipFill>
-                    <a:blip r:embed="rId16" cstate="none"/>
+                    <a:blip r:embed="rId15" cstate="none"/>
                     <a:srcRect/>
                     <a:stretch>
                       <a:fillRect/>
@@ -27110,6 +27506,18 @@
       <w:r>
         <w:rPr>
           <w:rFonts w:ascii="Times New Roman" w:cs="Times New Roman" w:eastAsia="Times New Roman" w:hAnsi="Times New Roman"/>
+          <w:b/>
+          <w:bCs/>
+          <w:i w:val="false"/>
+          <w:iCs w:val="false"/>
+          <w:sz w:val="24"/>
+          <w:szCs w:val="24"/>
+        </w:rPr>
+        <w:t xml:space="preserve">Estabilidade entre ondas: achado preliminar. </w:t>
+      </w:r>
+      <w:r>
+        <w:rPr>
+          <w:rFonts w:ascii="Times New Roman" w:cs="Times New Roman" w:eastAsia="Times New Roman" w:hAnsi="Times New Roman"/>
           <w:b w:val="false"/>
           <w:bCs w:val="false"/>
           <w:i w:val="false"/>
@@ -27117,7 +27525,7 @@
           <w:sz w:val="24"/>
           <w:szCs w:val="24"/>
         </w:rPr>
-        <w:t xml:space="preserve">Registra-se, por fim, que as larguras marginais praticamente não se alteraram entre a primeira e a segunda onda. As ondas convergiram, e uma terceira não reduziria o espaço, porque o limite encontrado é de identificabilidade estrutural e não de tamanho de amostra.</w:t>
+        <w:t xml:space="preserve">As larguras marginais praticamente não se alteraram entre a primeira e a segunda onda. Essa estabilidade é compatível com um limite de identificabilidade estrutural, e não de tamanho de amostra, mas a hipótese ainda não está demonstrada: a segunda onda foi amostrada a partir do mesmo gerador da primeira, e um desenho amostral independente é necessário para distinguir estabilidade real de estabilidade herdada do delineamento. Até que essa verificação seja executada, o achado é registrado como preliminar, e não se afirma que uma terceira onda não reduziria o espaço.</w:t>
       </w:r>
     </w:p>
     <w:p>
@@ -27153,7 +27561,7 @@
           <w:sz w:val="24"/>
           <w:szCs w:val="24"/>
         </w:rPr>
-        <w:t xml:space="preserve">A Tabela 15 resume a procedência dos parâmetros do modelo, segundo a classificação mantida no arquivo único de configuração. A distinção é mantida explícita porque a credibilidade de um modelo de simulação depende menos do número de parâmetros do que da clareza sobre a origem de cada um.</w:t>
+        <w:t xml:space="preserve">A Tabela 16 resume a procedência dos parâmetros do modelo, segundo a classificação mantida no arquivo único de configuração. A distinção é mantida explícita porque a credibilidade de um modelo de simulação depende menos do número de parâmetros do que da clareza sobre a origem de cada um.</w:t>
       </w:r>
     </w:p>
     <w:p>
@@ -27169,7 +27577,7 @@
           <w:sz w:val="20"/>
           <w:szCs w:val="20"/>
         </w:rPr>
-        <w:t xml:space="preserve">Tabela 15 – Procedência dos parâmetros do modelo</w:t>
+        <w:t xml:space="preserve">Tabela 16 – Procedência dos parâmetros do modelo</w:t>
       </w:r>
     </w:p>
     <w:tbl>
@@ -27819,7 +28227,7 @@
           <w:sz w:val="24"/>
           <w:szCs w:val="24"/>
         </w:rPr>
-        <w:t xml:space="preserve">Quatro limitações são declaradas. Primeira, a transferência ordinal de risco entre domínios pressupõe que o gradiente de risco por dificuldade seja transferível, ainda que o nível absoluto não seja; trata-se de suposição, e não de resultado. Segunda, a validação externa do retrabalho é um teste fraco, pelas razões expostas na Seção 2.7. Terceira, o teste do gêmeo idêntico é otimista por construção, uma vez que anula a discrepância entre modelo e realidade. Quarta, três dos cinco parâmetros submetidos à calibração não são identificáveis com os observáveis do delineamento atual, e assim são reportados.</w:t>
+        <w:t xml:space="preserve">Quatro limitações são declaradas. Primeira, a transferência ordinal de risco entre domínios pressupõe que o gradiente de risco por dificuldade seja transferível, ainda que o nível absoluto não seja; trata-se de suposição, e não de resultado. Segunda, e mais importante para a leitura desta entrega, NÃO foi realizada validação externa do simulador: não há aqui nenhum critério confrontado com observação de campo que pudesse reprová-lo. A comparação da fração de retrabalho com a literatura funciona apenas como verificação de ordem de grandeza, e a Seção 2.7 demonstra que ela aprova em toda a faixa declarada do parâmetro de risco basal, isto é, que seu poder de rejeição é nulo. Terceira, o teste do gêmeo idêntico é otimista por construção, uma vez que anula a discrepância entre modelo e realidade. Quarta, três dos cinco parâmetros submetidos à calibração não são identificáveis com os observáveis do delineamento atual, e assim são reportados.</w:t>
       </w:r>
     </w:p>
     <w:p>

</xml_diff>

<commit_message>
Auditoria final: corrige inversao do 23,8%, reclassifica 7d/7e, anota Holm na fig2, versiona bruto da Porta 2
</commit_message>
<xml_diff>
--- a/docs/entrega1_metodologia_resultados_iniciais.docx
+++ b/docs/entrega1_metodologia_resultados_iniciais.docx
@@ -1437,7 +1437,7 @@
           <w:sz w:val="24"/>
           <w:szCs w:val="24"/>
         </w:rPr>
-        <w:t xml:space="preserve">Os multiplicadores de produtividade μ_cognitivo e μ_rede são produzidos por um sistema de inferência difusa de Mamdani–Assilian com duas entradas, três termos linguísticos triangulares por variável, base completa de nove regras e defuzzificação por centroide, conforme especificado na fase conceitual do trabalho e conforme a prática consolidada de acoplar lógica difusa a modelos de dinâmica de sistemas (LIU; TRIANTIS; SARANGI, 2011).</w:t>
+        <w:t xml:space="preserve">Os multiplicadores de produtividade μ_cognitivo e μ_rede são produzidos por um sistema de inferência difusa de Mamdani–Assilian com duas entradas, três termos linguísticos triangulares por variável, base completa de nove regras e defuzzificação por centroide, seguindo a prática consolidada de acoplar lógica difusa a modelos de dinâmica de sistemas (LIU; TRIANTIS; SARANGI, 2011). Esta estrutura é decisão do TCC II, e não herança da fase conceitual: o TCC I anuncia o emprego de lógica difusa e cita exemplos — funções de pertinência triangulares e inferência pelo método máx-mín —, mas não define quais variáveis entram, quantos termos linguísticos cada uma tem, qual é a base de regras nem o método de defuzzificação. A escolha aqui adotada inclusive DIVERGE do exemplo citado na fase conceitual: a t-norma mínimo foi substituída pela t-norma produto, pela razão exposta adiante nesta seção.</w:t>
       </w:r>
     </w:p>
     <w:p>
@@ -10542,7 +10542,7 @@
                 <w:sz w:val="18"/>
                 <w:szCs w:val="18"/>
               </w:rPr>
-              <w:t xml:space="preserve">condição ideal elimina a ociosidade (TU = 0)</w:t>
+              <w:t xml:space="preserve">[contingente a amostra] condição ideal elimina a ociosidade (TU = 0)</w:t>
             </w:r>
           </w:p>
         </w:tc>
@@ -10569,7 +10569,7 @@
                 <w:sz w:val="18"/>
                 <w:szCs w:val="18"/>
               </w:rPr>
-              <w:t xml:space="preserve">comportamento</w:t>
+              <w:t xml:space="preserve">contingente</w:t>
             </w:r>
           </w:p>
         </w:tc>
@@ -10623,7 +10623,7 @@
                 <w:sz w:val="18"/>
                 <w:szCs w:val="18"/>
               </w:rPr>
-              <w:t xml:space="preserve">TU máximo = 0,0</w:t>
+              <w:t xml:space="preserve">TU máximo = 0,0 - Di máximo nas 12…</w:t>
             </w:r>
           </w:p>
         </w:tc>
@@ -10679,7 +10679,7 @@
                 <w:sz w:val="18"/>
                 <w:szCs w:val="18"/>
               </w:rPr>
-              <w:t xml:space="preserve">condição ideal conclui mais rápido que a nominal (pareado)</w:t>
+              <w:t xml:space="preserve">[comportamento sob condição ideal] conclui mais rápido que a nominal (pareado)</w:t>
             </w:r>
           </w:p>
         </w:tc>
@@ -10706,7 +10706,7 @@
                 <w:sz w:val="18"/>
                 <w:szCs w:val="18"/>
               </w:rPr>
-              <w:t xml:space="preserve">comportamento</w:t>
+              <w:t xml:space="preserve">cond. ideal</w:t>
             </w:r>
           </w:p>
         </w:tc>
@@ -10760,7 +10760,7 @@
                 <w:sz w:val="18"/>
                 <w:szCs w:val="18"/>
               </w:rPr>
-              <w:t xml:space="preserve">24 de 24 pares favoráveis</w:t>
+              <w:t xml:space="preserve">24 de 24 pares favoráveis - ganho medio…</w:t>
             </w:r>
           </w:p>
         </w:tc>
@@ -15788,7 +15788,7 @@
           <w:sz w:val="24"/>
           <w:szCs w:val="24"/>
         </w:rPr>
-        <w:t xml:space="preserve">A última linha da Tabela 9 move-se em sentido contrário a todas as demais. A investigação dessa discrepância revelou defeito na formulação original da métrica, e não achado substantivo. A razão entre retrabalho e esforço realizado tem por denominador o esforço efetivamente despendido, que inclui o tempo ocioso e bloqueado. O braço centralizado acumula tempo ocioso muito superior — cento e vinte e seis contra seis períodos em média — e, ao inflar o próprio denominador, dilui o retrabalho e aparenta desempenho melhor, ainda que seu retrabalho absoluto seja vinte e três vírgula oito por cento maior. A métrica premiava a ineficiência que se pretendia medir.</w:t>
+        <w:t xml:space="preserve">A última linha da Tabela 9 move-se em sentido contrário a todas as demais. A investigação dessa discrepância revelou defeito na formulação original da métrica, e não achado substantivo. A razão entre retrabalho e esforço realizado tem por denominador o esforço efetivamente despendido, que inclui o tempo ocioso e bloqueado. O braço centralizado acumula tempo ocioso muito superior — cento e vinte e seis contra seis períodos em média — e, ao inflar o próprio denominador, dilui o retrabalho e aparenta desempenho melhor, ainda que seu esforço de retrabalho absoluto seja trinta e um vírgula um por cento MAIOR que o do arranjo adaptativo — equivalentemente, o do arranjo adaptativo é vinte e três vírgula oito por cento MENOR que o do centralizado. As duas leituras vêm dos mesmos valores, 68,87 contra 52,51, e diferem apenas na base da razão; a redução de vinte e três vírgula oito por cento é sempre relativa ao braço centralizado. A métrica premiava a ineficiência que se pretendia medir.</w:t>
       </w:r>
     </w:p>
     <w:p>

</xml_diff>

<commit_message>
Ajusta linguagem residual de B7: unidade de inferencia na 1.9 e 2.8
</commit_message>
<xml_diff>
--- a/docs/entrega1_metodologia_resultados_iniciais.docx
+++ b/docs/entrega1_metodologia_resultados_iniciais.docx
@@ -4153,7 +4153,7 @@
           <w:sz w:val="24"/>
           <w:szCs w:val="24"/>
         </w:rPr>
-        <w:t xml:space="preserve">Cada par de execuções emprega a mesma instância e a mesma semente aleatória nos dois braços. A variação atribuível à instância e ao sorteio é, portanto, comum aos dois e cancela-se na diferença, o que eleva substancialmente a potência estatística em relação a um delineamento independente de mesmo tamanho. A inferência emprega o teste de Wilcoxon para amostras pareadas, e não o teste t, porque as saídas do modelo são assimétricas e limitadas inferiormente por zero. O tamanho de efeito é reportado pelo d de Cohen pareado e pela proporção de pares favoráveis, uma vez que, com centenas de pares, o valor-p isoladamente não distingue diferença relevante de diferença meramente detectável.</w:t>
+        <w:t xml:space="preserve">Cada par de execuções emprega a mesma instância e a mesma semente aleatória nos dois braços. A variação atribuível à instância e ao sorteio é, portanto, comum aos dois e cancela-se na diferença, o que eleva substancialmente a potência estatística em relação a um delineamento independente de mesmo tamanho. A inferência emprega o teste de Wilcoxon para amostras pareadas, e não o teste t, porque as saídas do modelo são assimétricas e limitadas inferiormente por zero. O tamanho de efeito é reportado pelo d de Cohen pareado e pela proporção de instâncias favoráveis, complementando o valor-p com medidas de magnitude e de consistência do contraste. O valor-p sozinho não distingue diferença relevante de diferença meramente detectável, e com dezesseis unidades ele satura rapidamente no seu piso, de modo que a leitura substantiva depende das outras duas medidas.</w:t>
       </w:r>
     </w:p>
     <w:p>
@@ -14055,7 +14055,7 @@
           <w:sz w:val="24"/>
           <w:szCs w:val="24"/>
         </w:rPr>
-        <w:t xml:space="preserve">O experimento comparou os dois arranjos da Tabela 2 sobre dezesseis instâncias do J60 com doze sementes cada, totalizando trezentas e oitenta e quatro execuções pareadas. Nenhuma execução deixou de concluir dentro do horizonte estabelecido. A Tabela 9 apresenta os resultados.</w:t>
+        <w:t xml:space="preserve">O experimento comparou os dois arranjos da Tabela 2 sobre dezesseis instâncias do J60, com doze sementes cada. São trezentas e oitenta e quatro execuções no total, organizadas em cento e noventa e dois pares de instância e semente — cada par confronta os dois arranjos sob a mesma instância e a mesma semente. A unidade da inferência final, porém, não é o par e sim a INSTÂNCIA: as doze sementes de cada instância são agregadas pela média, e os testes correm sobre as dezesseis instâncias resultantes, pelas razões expostas adiante nesta seção. Nenhuma execução deixou de concluir dentro do horizonte estabelecido. A Tabela 9 apresenta os resultados.</w:t>
       </w:r>
     </w:p>
     <w:p>

</xml_diff>